<commit_message>
TS 7.1 Krama corrections
</commit_message>
<xml_diff>
--- a/TS-Kramam/TS-7.1/TS 7.1 Tamil Krama Paatam Corrections.docx
+++ b/TS-Kramam/TS-7.1/TS 7.1 Tamil Krama Paatam Corrections.docx
@@ -1,7 +1,19 @@
 
 <file path=word/document.xml><?xml version="1.0" encoding="utf-8"?>
-<w:document xmlns:wpc="http://schemas.microsoft.com/office/word/2010/wordprocessingCanvas" xmlns:cx="http://schemas.microsoft.com/office/drawing/2014/chartex" xmlns:cx1="http://schemas.microsoft.com/office/drawing/2015/9/8/chartex" xmlns:cx2="http://schemas.microsoft.com/office/drawing/2015/10/21/chartex" xmlns:cx3="http://schemas.microsoft.com/office/drawing/2016/5/9/chartex" xmlns:cx4="http://schemas.microsoft.com/office/drawing/2016/5/10/chartex" xmlns:cx5="http://schemas.microsoft.com/office/drawing/2016/5/11/chartex" xmlns:cx6="http://schemas.microsoft.com/office/drawing/2016/5/12/chartex" xmlns:cx7="http://schemas.microsoft.com/office/drawing/2016/5/13/chartex" xmlns:cx8="http://schemas.microsoft.com/office/drawing/2016/5/14/chartex" xmlns:mc="http://schemas.openxmlformats.org/markup-compatibility/2006" xmlns:aink="http://schemas.microsoft.com/office/drawing/2016/ink" xmlns:am3d="http://schemas.microsoft.com/office/drawing/2017/model3d" xmlns:o="urn:schemas-microsoft-com:office:office" xmlns:oel="http://schemas.microsoft.com/office/2019/extlst" xmlns:r="http://schemas.openxmlformats.org/officeDocument/2006/relationships" xmlns:m="http://schemas.openxmlformats.org/officeDocument/2006/math" xmlns:v="urn:schemas-microsoft-com:vml" xmlns:wp14="http://schemas.microsoft.com/office/word/2010/wordprocessingDrawing" xmlns:wp="http://schemas.openxmlformats.org/drawingml/2006/wordprocessingDrawing" xmlns:w10="urn:schemas-microsoft-com:office:word" xmlns:w="http://schemas.openxmlformats.org/wordprocessingml/2006/main" xmlns:w14="http://schemas.microsoft.com/office/word/2010/wordml" xmlns:w15="http://schemas.microsoft.com/office/word/2012/wordml" xmlns:w16cex="http://schemas.microsoft.com/office/word/2018/wordml/cex" xmlns:w16cid="http://schemas.microsoft.com/office/word/2016/wordml/cid" xmlns:w16="http://schemas.microsoft.com/office/word/2018/wordml" xmlns:w16sdtdh="http://schemas.microsoft.com/office/word/2020/wordml/sdtdatahash" xmlns:w16se="http://schemas.microsoft.com/office/word/2015/wordml/symex" xmlns:wpg="http://schemas.microsoft.com/office/word/2010/wordprocessingGroup" xmlns:wpi="http://schemas.microsoft.com/office/word/2010/wordprocessingInk" xmlns:wne="http://schemas.microsoft.com/office/word/2006/wordml" xmlns:wps="http://schemas.microsoft.com/office/word/2010/wordprocessingShape" mc:Ignorable="w14 w15 w16se w16cid w16 w16cex w16sdtdh wp14">
+<w:document xmlns:wpc="http://schemas.microsoft.com/office/word/2010/wordprocessingCanvas" xmlns:cx="http://schemas.microsoft.com/office/drawing/2014/chartex" xmlns:cx1="http://schemas.microsoft.com/office/drawing/2015/9/8/chartex" xmlns:cx2="http://schemas.microsoft.com/office/drawing/2015/10/21/chartex" xmlns:cx3="http://schemas.microsoft.com/office/drawing/2016/5/9/chartex" xmlns:cx4="http://schemas.microsoft.com/office/drawing/2016/5/10/chartex" xmlns:cx5="http://schemas.microsoft.com/office/drawing/2016/5/11/chartex" xmlns:cx6="http://schemas.microsoft.com/office/drawing/2016/5/12/chartex" xmlns:cx7="http://schemas.microsoft.com/office/drawing/2016/5/13/chartex" xmlns:cx8="http://schemas.microsoft.com/office/drawing/2016/5/14/chartex" xmlns:mc="http://schemas.openxmlformats.org/markup-compatibility/2006" xmlns:aink="http://schemas.microsoft.com/office/drawing/2016/ink" xmlns:am3d="http://schemas.microsoft.com/office/drawing/2017/model3d" xmlns:o="urn:schemas-microsoft-com:office:office" xmlns:oel="http://schemas.microsoft.com/office/2019/extlst" xmlns:r="http://schemas.openxmlformats.org/officeDocument/2006/relationships" xmlns:m="http://schemas.openxmlformats.org/officeDocument/2006/math" xmlns:v="urn:schemas-microsoft-com:vml" xmlns:wp14="http://schemas.microsoft.com/office/word/2010/wordprocessingDrawing" xmlns:wp="http://schemas.openxmlformats.org/drawingml/2006/wordprocessingDrawing" xmlns:w10="urn:schemas-microsoft-com:office:word" xmlns:w="http://schemas.openxmlformats.org/wordprocessingml/2006/main" xmlns:w14="http://schemas.microsoft.com/office/word/2010/wordml" xmlns:w15="http://schemas.microsoft.com/office/word/2012/wordml" xmlns:w16cex="http://schemas.microsoft.com/office/word/2018/wordml/cex" xmlns:w16cid="http://schemas.microsoft.com/office/word/2016/wordml/cid" xmlns:w16="http://schemas.microsoft.com/office/word/2018/wordml" xmlns:w16du="http://schemas.microsoft.com/office/word/2023/wordml/word16du" xmlns:w16sdtdh="http://schemas.microsoft.com/office/word/2020/wordml/sdtdatahash" xmlns:w16sdtfl="http://schemas.microsoft.com/office/word/2024/wordml/sdtformatlock" xmlns:w16se="http://schemas.microsoft.com/office/word/2015/wordml/symex" xmlns:wpg="http://schemas.microsoft.com/office/word/2010/wordprocessingGroup" xmlns:wpi="http://schemas.microsoft.com/office/word/2010/wordprocessingInk" xmlns:wne="http://schemas.microsoft.com/office/word/2006/wordml" xmlns:wps="http://schemas.microsoft.com/office/word/2010/wordprocessingShape" mc:Ignorable="w14 w15 w16se w16cid w16 w16cex w16sdtdh w16sdtfl w16du wp14">
   <w:body>
+    <w:p>
+      <w:pPr>
+        <w:jc w:val="center"/>
+        <w:rPr>
+          <w:b/>
+          <w:bCs/>
+          <w:sz w:val="32"/>
+          <w:szCs w:val="32"/>
+          <w:u w:val="single"/>
+        </w:rPr>
+      </w:pPr>
+    </w:p>
     <w:p>
       <w:pPr>
         <w:jc w:val="center"/>
@@ -21,6 +33,3222 @@
           <w:szCs w:val="32"/>
           <w:u w:val="single"/>
         </w:rPr>
+        <w:t xml:space="preserve">TS </w:t>
+      </w:r>
+      <w:r>
+        <w:rPr>
+          <w:b/>
+          <w:bCs/>
+          <w:sz w:val="32"/>
+          <w:szCs w:val="32"/>
+          <w:u w:val="single"/>
+        </w:rPr>
+        <w:t>Krama</w:t>
+      </w:r>
+      <w:r>
+        <w:rPr>
+          <w:b/>
+          <w:bCs/>
+          <w:sz w:val="32"/>
+          <w:szCs w:val="32"/>
+          <w:u w:val="single"/>
+        </w:rPr>
+        <w:t xml:space="preserve"> Paatam – TS </w:t>
+      </w:r>
+      <w:r>
+        <w:rPr>
+          <w:b/>
+          <w:bCs/>
+          <w:sz w:val="32"/>
+          <w:szCs w:val="32"/>
+          <w:u w:val="single"/>
+        </w:rPr>
+        <w:t xml:space="preserve">7.1 Tamil </w:t>
+      </w:r>
+      <w:r>
+        <w:rPr>
+          <w:b/>
+          <w:bCs/>
+          <w:sz w:val="32"/>
+          <w:szCs w:val="32"/>
+          <w:u w:val="single"/>
+        </w:rPr>
+        <w:t>Corrections –</w:t>
+      </w:r>
+      <w:r>
+        <w:rPr>
+          <w:b/>
+          <w:bCs/>
+          <w:sz w:val="32"/>
+          <w:szCs w:val="32"/>
+          <w:u w:val="single"/>
+        </w:rPr>
+        <w:t xml:space="preserve"> </w:t>
+      </w:r>
+      <w:r>
+        <w:rPr>
+          <w:b/>
+          <w:bCs/>
+          <w:sz w:val="32"/>
+          <w:szCs w:val="32"/>
+          <w:u w:val="single"/>
+        </w:rPr>
+        <w:t xml:space="preserve">Observed till </w:t>
+      </w:r>
+      <w:r>
+        <w:rPr>
+          <w:b/>
+          <w:bCs/>
+          <w:color w:val="EE0000"/>
+          <w:sz w:val="32"/>
+          <w:szCs w:val="32"/>
+          <w:u w:val="single"/>
+        </w:rPr>
+        <w:t>xxxxxxxxx</w:t>
+      </w:r>
+      <w:r>
+        <w:rPr>
+          <w:b/>
+          <w:bCs/>
+          <w:color w:val="EE0000"/>
+          <w:sz w:val="32"/>
+          <w:szCs w:val="32"/>
+          <w:u w:val="single"/>
+        </w:rPr>
+        <w:t>,2026</w:t>
+      </w:r>
+    </w:p>
+    <w:p>
+      <w:pPr>
+        <w:jc w:val="center"/>
+        <w:rPr>
+          <w:b/>
+          <w:bCs/>
+        </w:rPr>
+      </w:pPr>
+      <w:r>
+        <w:rPr>
+          <w:b/>
+          <w:bCs/>
+        </w:rPr>
+        <w:t>(ignore those which are already incorporated in your book’s version and date)</w:t>
+      </w:r>
+    </w:p>
+    <w:tbl>
+      <w:tblPr>
+        <w:tblW w:w="13840" w:type="dxa"/>
+        <w:tblInd w:w="-797" w:type="dxa"/>
+        <w:tblBorders>
+          <w:top w:val="single" w:sz="4" w:space="0" w:color="000000"/>
+          <w:left w:val="single" w:sz="4" w:space="0" w:color="000000"/>
+          <w:bottom w:val="single" w:sz="4" w:space="0" w:color="000000"/>
+          <w:right w:val="single" w:sz="4" w:space="0" w:color="000000"/>
+          <w:insideH w:val="single" w:sz="4" w:space="0" w:color="000000"/>
+          <w:insideV w:val="single" w:sz="4" w:space="0" w:color="000000"/>
+        </w:tblBorders>
+        <w:tblLook w:val="04A0" w:firstRow="1" w:lastRow="0" w:firstColumn="1" w:lastColumn="0" w:noHBand="0" w:noVBand="1"/>
+      </w:tblPr>
+      <w:tblGrid>
+        <w:gridCol w:w="3878"/>
+        <w:gridCol w:w="4740"/>
+        <w:gridCol w:w="5222"/>
+      </w:tblGrid>
+      <w:tr>
+        <w:tc>
+          <w:tcPr>
+            <w:tcW w:w="3878" w:type="dxa"/>
+          </w:tcPr>
+          <w:p>
+            <w:pPr>
+              <w:spacing w:before="0" w:line="240" w:lineRule="auto"/>
+              <w:jc w:val="center"/>
+              <w:rPr>
+                <w:b/>
+                <w:bCs/>
+                <w:sz w:val="32"/>
+                <w:szCs w:val="32"/>
+              </w:rPr>
+            </w:pPr>
+            <w:r>
+              <w:rPr>
+                <w:b/>
+                <w:bCs/>
+                <w:sz w:val="32"/>
+                <w:szCs w:val="32"/>
+              </w:rPr>
+              <w:t>Section, Paragraph</w:t>
+            </w:r>
+          </w:p>
+          <w:p>
+            <w:pPr>
+              <w:spacing w:before="0" w:line="240" w:lineRule="auto"/>
+              <w:jc w:val="center"/>
+              <w:rPr>
+                <w:b/>
+                <w:bCs/>
+                <w:sz w:val="32"/>
+                <w:szCs w:val="32"/>
+              </w:rPr>
+            </w:pPr>
+            <w:r>
+              <w:rPr>
+                <w:b/>
+                <w:bCs/>
+                <w:sz w:val="32"/>
+                <w:szCs w:val="32"/>
+              </w:rPr>
+              <w:t>Reference</w:t>
+            </w:r>
+          </w:p>
+        </w:tc>
+        <w:tc>
+          <w:tcPr>
+            <w:tcW w:w="4740" w:type="dxa"/>
+          </w:tcPr>
+          <w:p>
+            <w:pPr>
+              <w:spacing w:before="0" w:line="240" w:lineRule="auto"/>
+              <w:jc w:val="center"/>
+              <w:rPr>
+                <w:b/>
+                <w:bCs/>
+                <w:sz w:val="32"/>
+                <w:szCs w:val="32"/>
+              </w:rPr>
+            </w:pPr>
+            <w:r>
+              <w:rPr>
+                <w:b/>
+                <w:bCs/>
+                <w:sz w:val="32"/>
+                <w:szCs w:val="32"/>
+              </w:rPr>
+              <w:t>As Printed</w:t>
+            </w:r>
+          </w:p>
+        </w:tc>
+        <w:tc>
+          <w:tcPr>
+            <w:tcW w:w="5222" w:type="dxa"/>
+          </w:tcPr>
+          <w:p>
+            <w:pPr>
+              <w:spacing w:before="0" w:line="240" w:lineRule="auto"/>
+              <w:ind w:right="-18"/>
+              <w:jc w:val="center"/>
+              <w:rPr>
+                <w:b/>
+                <w:bCs/>
+                <w:sz w:val="32"/>
+                <w:szCs w:val="32"/>
+              </w:rPr>
+            </w:pPr>
+            <w:r>
+              <w:rPr>
+                <w:b/>
+                <w:bCs/>
+                <w:sz w:val="32"/>
+                <w:szCs w:val="32"/>
+              </w:rPr>
+              <w:t>To be read as or corrected as</w:t>
+            </w:r>
+          </w:p>
+        </w:tc>
+      </w:tr>
+      <w:tr>
+        <w:trPr>
+          <w:trHeight w:val="964"/>
+        </w:trPr>
+        <w:tc>
+          <w:tcPr>
+            <w:tcW w:w="3878" w:type="dxa"/>
+          </w:tcPr>
+          <w:p>
+            <w:pPr>
+              <w:widowControl w:val="0"/>
+              <w:tabs>
+                <w:tab w:val="left" w:pos="993"/>
+              </w:tabs>
+              <w:autoSpaceDE w:val="0"/>
+              <w:autoSpaceDN w:val="0"/>
+              <w:adjustRightInd w:val="0"/>
+              <w:spacing w:before="0" w:line="252" w:lineRule="auto"/>
+              <w:ind w:right="297"/>
+              <w:rPr>
+                <w:rFonts w:cs="Arial"/>
+                <w:b/>
+                <w:sz w:val="28"/>
+                <w:szCs w:val="28"/>
+              </w:rPr>
+            </w:pPr>
+            <w:r>
+              <w:rPr>
+                <w:rFonts w:cs="Arial"/>
+                <w:b/>
+                <w:sz w:val="28"/>
+                <w:szCs w:val="28"/>
+              </w:rPr>
+              <w:t>T.S.7.1.</w:t>
+            </w:r>
+            <w:r>
+              <w:rPr>
+                <w:rFonts w:cs="Arial"/>
+                <w:b/>
+                <w:sz w:val="28"/>
+                <w:szCs w:val="28"/>
+              </w:rPr>
+              <w:t>5.7</w:t>
+            </w:r>
+            <w:r>
+              <w:rPr>
+                <w:rFonts w:cs="Arial"/>
+                <w:b/>
+                <w:sz w:val="28"/>
+                <w:szCs w:val="28"/>
+              </w:rPr>
+              <w:t xml:space="preserve"> – Kramam</w:t>
+            </w:r>
+          </w:p>
+          <w:p>
+            <w:pPr>
+              <w:widowControl w:val="0"/>
+              <w:tabs>
+                <w:tab w:val="left" w:pos="993"/>
+              </w:tabs>
+              <w:autoSpaceDE w:val="0"/>
+              <w:autoSpaceDN w:val="0"/>
+              <w:adjustRightInd w:val="0"/>
+              <w:spacing w:before="0" w:line="252" w:lineRule="auto"/>
+              <w:ind w:right="297"/>
+              <w:rPr>
+                <w:rFonts w:cs="Arial"/>
+                <w:b/>
+                <w:sz w:val="28"/>
+                <w:szCs w:val="28"/>
+              </w:rPr>
+            </w:pPr>
+            <w:r>
+              <w:rPr>
+                <w:rFonts w:cs="Arial"/>
+                <w:b/>
+                <w:sz w:val="28"/>
+                <w:szCs w:val="28"/>
+              </w:rPr>
+              <w:t xml:space="preserve">Krama Vaakyam No.– </w:t>
+            </w:r>
+            <w:r>
+              <w:rPr>
+                <w:rFonts w:cs="Arial"/>
+                <w:b/>
+                <w:sz w:val="28"/>
+                <w:szCs w:val="28"/>
+              </w:rPr>
+              <w:t>51</w:t>
+            </w:r>
+          </w:p>
+          <w:p>
+            <w:pPr>
+              <w:widowControl w:val="0"/>
+              <w:tabs>
+                <w:tab w:val="left" w:pos="993"/>
+              </w:tabs>
+              <w:autoSpaceDE w:val="0"/>
+              <w:autoSpaceDN w:val="0"/>
+              <w:adjustRightInd w:val="0"/>
+              <w:spacing w:before="0" w:line="252" w:lineRule="auto"/>
+              <w:ind w:right="297"/>
+              <w:rPr>
+                <w:rFonts w:cs="Arial"/>
+                <w:b/>
+                <w:sz w:val="28"/>
+                <w:szCs w:val="32"/>
+              </w:rPr>
+            </w:pPr>
+            <w:r>
+              <w:rPr>
+                <w:rFonts w:cs="Arial"/>
+                <w:b/>
+                <w:sz w:val="28"/>
+                <w:szCs w:val="28"/>
+              </w:rPr>
+              <w:t xml:space="preserve">Panchaati No. - </w:t>
+            </w:r>
+            <w:r>
+              <w:rPr>
+                <w:rFonts w:cs="Arial"/>
+                <w:b/>
+                <w:sz w:val="28"/>
+                <w:szCs w:val="28"/>
+              </w:rPr>
+              <w:t>2</w:t>
+            </w:r>
+            <w:r>
+              <w:rPr>
+                <w:rFonts w:cs="Arial"/>
+                <w:b/>
+                <w:sz w:val="28"/>
+                <w:szCs w:val="28"/>
+              </w:rPr>
+              <w:t>0</w:t>
+            </w:r>
+          </w:p>
+        </w:tc>
+        <w:tc>
+          <w:tcPr>
+            <w:tcW w:w="4740" w:type="dxa"/>
+          </w:tcPr>
+          <w:p>
+            <w:pPr>
+              <w:widowControl w:val="0"/>
+              <w:autoSpaceDE w:val="0"/>
+              <w:autoSpaceDN w:val="0"/>
+              <w:adjustRightInd w:val="0"/>
+              <w:spacing w:before="0" w:line="240" w:lineRule="auto"/>
+              <w:rPr>
+                <w:rFonts w:ascii="BRH Malayalam Extra" w:eastAsia="Times New Roman" w:hAnsi="BRH Malayalam Extra" w:cs="BRH Malayalam Extra"/>
+                <w:color w:val="000000"/>
+                <w:sz w:val="40"/>
+                <w:szCs w:val="40"/>
+                <w:lang w:val="en-IN" w:eastAsia="en-IN" w:bidi="ml-IN"/>
+              </w:rPr>
+            </w:pPr>
+            <w:r>
+              <w:rPr>
+                <w:rFonts w:ascii="Latha" w:hAnsi="Latha" w:cs="Latha"/>
+                <w:sz w:val="28"/>
+                <w:szCs w:val="28"/>
+                <w:cs/>
+                <w:lang w:bidi="ta-IN"/>
+              </w:rPr>
+              <w:t>ஸு</w:t>
+            </w:r>
+            <w:r>
+              <w:rPr>
+                <w:rFonts w:ascii="BRH Tamil Tab Extra" w:hAnsi="BRH Tamil Tab Extra" w:cs="Latha"/>
+                <w:b/>
+                <w:sz w:val="32"/>
+                <w:szCs w:val="28"/>
+                <w:lang w:bidi="ta-IN"/>
+              </w:rPr>
+              <w:t>…</w:t>
+            </w:r>
+            <w:r>
+              <w:rPr>
+                <w:rFonts w:ascii="Latha" w:hAnsi="Latha" w:cs="Latha"/>
+                <w:sz w:val="28"/>
+                <w:szCs w:val="28"/>
+                <w:cs/>
+                <w:lang w:bidi="ta-IN"/>
+              </w:rPr>
+              <w:t>வ</w:t>
+            </w:r>
+            <w:r>
+              <w:rPr>
+                <w:rFonts w:ascii="BRH Tamil Tab Extra" w:hAnsi="BRH Tamil Tab Extra" w:cs="Latha"/>
+                <w:b/>
+                <w:sz w:val="32"/>
+                <w:szCs w:val="28"/>
+                <w:lang w:bidi="ta-IN"/>
+              </w:rPr>
+              <w:t>…</w:t>
+            </w:r>
+            <w:r>
+              <w:rPr>
+                <w:rFonts w:ascii="Latha" w:hAnsi="Latha" w:cs="Latha"/>
+                <w:sz w:val="28"/>
+                <w:szCs w:val="28"/>
+                <w:cs/>
+                <w:lang w:bidi="ta-IN"/>
+              </w:rPr>
+              <w:t>ர்</w:t>
+            </w:r>
+            <w:r>
+              <w:rPr>
+                <w:rFonts w:ascii="Latha" w:hAnsi="Latha" w:cs="Latha"/>
+                <w:sz w:val="28"/>
+                <w:szCs w:val="28"/>
+                <w:highlight w:val="yellow"/>
+                <w:cs/>
+                <w:lang w:bidi="ta-IN"/>
+              </w:rPr>
+              <w:t>கா</w:t>
+            </w:r>
+            <w:r>
+              <w:rPr>
+                <w:rFonts w:ascii="Latha" w:hAnsi="Latha" w:cs="Latha"/>
+                <w:b/>
+                <w:bCs/>
+                <w:position w:val="-12"/>
+                <w:sz w:val="28"/>
+                <w:szCs w:val="28"/>
+                <w:highlight w:val="yellow"/>
+                <w:cs/>
+                <w:lang w:bidi="ta-IN"/>
+              </w:rPr>
+              <w:t>3</w:t>
+            </w:r>
+            <w:r>
+              <w:rPr>
+                <w:rFonts w:ascii="Latha" w:hAnsi="Latha" w:cs="Latha"/>
+                <w:sz w:val="28"/>
+                <w:szCs w:val="28"/>
+                <w:lang w:bidi="ta-IN"/>
+              </w:rPr>
+              <w:t xml:space="preserve"> </w:t>
+            </w:r>
+            <w:r>
+              <w:rPr>
+                <w:rFonts w:ascii="Latha" w:hAnsi="Latha" w:cs="Latha"/>
+                <w:sz w:val="28"/>
+                <w:szCs w:val="28"/>
+                <w:cs/>
+                <w:lang w:bidi="ta-IN"/>
+              </w:rPr>
+              <w:t>லோ</w:t>
+            </w:r>
+            <w:r>
+              <w:rPr>
+                <w:rFonts w:ascii="BRH Tamil Tab Extra" w:hAnsi="BRH Tamil Tab Extra" w:cs="Latha"/>
+                <w:b/>
+                <w:sz w:val="32"/>
+                <w:szCs w:val="28"/>
+                <w:lang w:bidi="ta-IN"/>
+              </w:rPr>
+              <w:t>…</w:t>
+            </w:r>
+            <w:r>
+              <w:rPr>
+                <w:rFonts w:ascii="Latha" w:hAnsi="Latha" w:cs="Latha"/>
+                <w:sz w:val="28"/>
+                <w:szCs w:val="28"/>
+                <w:cs/>
+                <w:lang w:bidi="ta-IN"/>
+              </w:rPr>
+              <w:t>க</w:t>
+            </w:r>
+            <w:r>
+              <w:rPr>
+                <w:rFonts w:ascii="Latha" w:hAnsi="Latha" w:cs="Latha"/>
+                <w:b/>
+                <w:bCs/>
+                <w:sz w:val="32"/>
+                <w:szCs w:val="32"/>
+                <w:cs/>
+                <w:lang w:bidi="ta-IN"/>
+              </w:rPr>
+              <w:t>:</w:t>
+            </w:r>
+            <w:r>
+              <w:rPr>
+                <w:rFonts w:ascii="Latha" w:hAnsi="Latha" w:cs="Latha"/>
+                <w:sz w:val="28"/>
+                <w:szCs w:val="28"/>
+                <w:lang w:bidi="ta-IN"/>
+              </w:rPr>
+              <w:t xml:space="preserve"> |</w:t>
+            </w:r>
+          </w:p>
+        </w:tc>
+        <w:tc>
+          <w:tcPr>
+            <w:tcW w:w="5222" w:type="dxa"/>
+          </w:tcPr>
+          <w:p>
+            <w:pPr>
+              <w:widowControl w:val="0"/>
+              <w:autoSpaceDE w:val="0"/>
+              <w:autoSpaceDN w:val="0"/>
+              <w:adjustRightInd w:val="0"/>
+              <w:spacing w:before="0" w:line="240" w:lineRule="auto"/>
+              <w:rPr>
+                <w:rFonts w:ascii="BRH Malayalam Extra" w:eastAsia="Times New Roman" w:hAnsi="BRH Malayalam Extra" w:cs="BRH Malayalam Extra"/>
+                <w:color w:val="000000"/>
+                <w:sz w:val="40"/>
+                <w:szCs w:val="40"/>
+                <w:lang w:val="en-IN" w:eastAsia="en-IN" w:bidi="ml-IN"/>
+              </w:rPr>
+            </w:pPr>
+            <w:r>
+              <w:rPr>
+                <w:rFonts w:ascii="Latha" w:hAnsi="Latha" w:cs="Latha"/>
+                <w:sz w:val="28"/>
+                <w:szCs w:val="28"/>
+                <w:cs/>
+                <w:lang w:bidi="ta-IN"/>
+              </w:rPr>
+              <w:t>ஸு</w:t>
+            </w:r>
+            <w:r>
+              <w:rPr>
+                <w:rFonts w:ascii="BRH Tamil Tab Extra" w:hAnsi="BRH Tamil Tab Extra" w:cs="Latha"/>
+                <w:b/>
+                <w:sz w:val="32"/>
+                <w:szCs w:val="28"/>
+                <w:lang w:bidi="ta-IN"/>
+              </w:rPr>
+              <w:t>…</w:t>
+            </w:r>
+            <w:r>
+              <w:rPr>
+                <w:rFonts w:ascii="Latha" w:hAnsi="Latha" w:cs="Latha"/>
+                <w:sz w:val="28"/>
+                <w:szCs w:val="28"/>
+                <w:cs/>
+                <w:lang w:bidi="ta-IN"/>
+              </w:rPr>
+              <w:t>வ</w:t>
+            </w:r>
+            <w:r>
+              <w:rPr>
+                <w:rFonts w:ascii="BRH Tamil Tab Extra" w:hAnsi="BRH Tamil Tab Extra" w:cs="Latha"/>
+                <w:b/>
+                <w:sz w:val="32"/>
+                <w:szCs w:val="28"/>
+                <w:lang w:bidi="ta-IN"/>
+              </w:rPr>
+              <w:t>…</w:t>
+            </w:r>
+            <w:r>
+              <w:rPr>
+                <w:rFonts w:ascii="Latha" w:hAnsi="Latha" w:cs="Latha"/>
+                <w:sz w:val="28"/>
+                <w:szCs w:val="28"/>
+                <w:cs/>
+                <w:lang w:bidi="ta-IN"/>
+              </w:rPr>
+              <w:t>ர்</w:t>
+            </w:r>
+            <w:r>
+              <w:rPr>
+                <w:rFonts w:ascii="Latha" w:hAnsi="Latha" w:cs="Latha" w:hint="cs"/>
+                <w:sz w:val="28"/>
+                <w:szCs w:val="28"/>
+                <w:highlight w:val="green"/>
+                <w:cs/>
+                <w:lang w:bidi="ta-IN"/>
+              </w:rPr>
+              <w:t>கோ</w:t>
+            </w:r>
+            <w:r>
+              <w:rPr>
+                <w:rFonts w:ascii="Latha" w:hAnsi="Latha" w:cs="Latha"/>
+                <w:b/>
+                <w:bCs/>
+                <w:position w:val="-12"/>
+                <w:sz w:val="28"/>
+                <w:szCs w:val="28"/>
+                <w:highlight w:val="green"/>
+                <w:cs/>
+                <w:lang w:bidi="ta-IN"/>
+              </w:rPr>
+              <w:t>3</w:t>
+            </w:r>
+            <w:r>
+              <w:rPr>
+                <w:rFonts w:ascii="Latha" w:hAnsi="Latha" w:cs="Latha"/>
+                <w:sz w:val="28"/>
+                <w:szCs w:val="28"/>
+                <w:lang w:bidi="ta-IN"/>
+              </w:rPr>
+              <w:t xml:space="preserve"> </w:t>
+            </w:r>
+            <w:r>
+              <w:rPr>
+                <w:rFonts w:ascii="Latha" w:hAnsi="Latha" w:cs="Latha"/>
+                <w:sz w:val="28"/>
+                <w:szCs w:val="28"/>
+                <w:cs/>
+                <w:lang w:bidi="ta-IN"/>
+              </w:rPr>
+              <w:t>லோ</w:t>
+            </w:r>
+            <w:r>
+              <w:rPr>
+                <w:rFonts w:ascii="BRH Tamil Tab Extra" w:hAnsi="BRH Tamil Tab Extra" w:cs="Latha"/>
+                <w:b/>
+                <w:sz w:val="32"/>
+                <w:szCs w:val="28"/>
+                <w:lang w:bidi="ta-IN"/>
+              </w:rPr>
+              <w:t>…</w:t>
+            </w:r>
+            <w:r>
+              <w:rPr>
+                <w:rFonts w:ascii="Latha" w:hAnsi="Latha" w:cs="Latha"/>
+                <w:sz w:val="28"/>
+                <w:szCs w:val="28"/>
+                <w:cs/>
+                <w:lang w:bidi="ta-IN"/>
+              </w:rPr>
+              <w:t>க</w:t>
+            </w:r>
+            <w:r>
+              <w:rPr>
+                <w:rFonts w:ascii="Latha" w:hAnsi="Latha" w:cs="Latha"/>
+                <w:b/>
+                <w:bCs/>
+                <w:sz w:val="32"/>
+                <w:szCs w:val="32"/>
+                <w:cs/>
+                <w:lang w:bidi="ta-IN"/>
+              </w:rPr>
+              <w:t>:</w:t>
+            </w:r>
+            <w:r>
+              <w:rPr>
+                <w:rFonts w:ascii="Latha" w:hAnsi="Latha" w:cs="Latha"/>
+                <w:sz w:val="28"/>
+                <w:szCs w:val="28"/>
+                <w:lang w:bidi="ta-IN"/>
+              </w:rPr>
+              <w:t xml:space="preserve"> |</w:t>
+            </w:r>
+          </w:p>
+        </w:tc>
+      </w:tr>
+      <w:tr>
+        <w:trPr>
+          <w:trHeight w:val="964"/>
+        </w:trPr>
+        <w:tc>
+          <w:tcPr>
+            <w:tcW w:w="3878" w:type="dxa"/>
+          </w:tcPr>
+          <w:p>
+            <w:pPr>
+              <w:widowControl w:val="0"/>
+              <w:tabs>
+                <w:tab w:val="left" w:pos="993"/>
+              </w:tabs>
+              <w:autoSpaceDE w:val="0"/>
+              <w:autoSpaceDN w:val="0"/>
+              <w:adjustRightInd w:val="0"/>
+              <w:spacing w:before="0" w:line="252" w:lineRule="auto"/>
+              <w:ind w:right="297"/>
+              <w:rPr>
+                <w:rFonts w:cs="Arial"/>
+                <w:b/>
+                <w:sz w:val="28"/>
+                <w:szCs w:val="28"/>
+              </w:rPr>
+            </w:pPr>
+            <w:r>
+              <w:rPr>
+                <w:rFonts w:cs="Arial"/>
+                <w:b/>
+                <w:sz w:val="28"/>
+                <w:szCs w:val="28"/>
+              </w:rPr>
+              <w:t>T.S.7.1.</w:t>
+            </w:r>
+            <w:r>
+              <w:rPr>
+                <w:rFonts w:cs="Arial"/>
+                <w:b/>
+                <w:sz w:val="28"/>
+                <w:szCs w:val="28"/>
+              </w:rPr>
+              <w:t>6</w:t>
+            </w:r>
+            <w:r>
+              <w:rPr>
+                <w:rFonts w:cs="Arial"/>
+                <w:b/>
+                <w:sz w:val="28"/>
+                <w:szCs w:val="28"/>
+              </w:rPr>
+              <w:t>.7 – Kramam</w:t>
+            </w:r>
+          </w:p>
+          <w:p>
+            <w:pPr>
+              <w:widowControl w:val="0"/>
+              <w:tabs>
+                <w:tab w:val="left" w:pos="993"/>
+              </w:tabs>
+              <w:autoSpaceDE w:val="0"/>
+              <w:autoSpaceDN w:val="0"/>
+              <w:adjustRightInd w:val="0"/>
+              <w:spacing w:before="0" w:line="252" w:lineRule="auto"/>
+              <w:ind w:right="297"/>
+              <w:rPr>
+                <w:rFonts w:cs="Arial"/>
+                <w:b/>
+                <w:sz w:val="28"/>
+                <w:szCs w:val="28"/>
+              </w:rPr>
+            </w:pPr>
+            <w:r>
+              <w:rPr>
+                <w:rFonts w:cs="Arial"/>
+                <w:b/>
+                <w:sz w:val="28"/>
+                <w:szCs w:val="28"/>
+              </w:rPr>
+              <w:t xml:space="preserve">Krama Vaakyam No.– </w:t>
+            </w:r>
+            <w:r>
+              <w:rPr>
+                <w:rFonts w:cs="Arial"/>
+                <w:b/>
+                <w:sz w:val="28"/>
+                <w:szCs w:val="28"/>
+              </w:rPr>
+              <w:t>33</w:t>
+            </w:r>
+          </w:p>
+          <w:p>
+            <w:pPr>
+              <w:widowControl w:val="0"/>
+              <w:tabs>
+                <w:tab w:val="left" w:pos="993"/>
+              </w:tabs>
+              <w:autoSpaceDE w:val="0"/>
+              <w:autoSpaceDN w:val="0"/>
+              <w:adjustRightInd w:val="0"/>
+              <w:spacing w:before="0" w:line="252" w:lineRule="auto"/>
+              <w:ind w:right="297"/>
+              <w:rPr>
+                <w:rFonts w:cs="Arial"/>
+                <w:b/>
+                <w:sz w:val="28"/>
+                <w:szCs w:val="28"/>
+              </w:rPr>
+            </w:pPr>
+            <w:r>
+              <w:rPr>
+                <w:rFonts w:cs="Arial"/>
+                <w:b/>
+                <w:sz w:val="28"/>
+                <w:szCs w:val="28"/>
+              </w:rPr>
+              <w:t>Panchaati No. - 2</w:t>
+            </w:r>
+            <w:r>
+              <w:rPr>
+                <w:rFonts w:cs="Arial"/>
+                <w:b/>
+                <w:sz w:val="28"/>
+                <w:szCs w:val="28"/>
+              </w:rPr>
+              <w:t>7</w:t>
+            </w:r>
+          </w:p>
+        </w:tc>
+        <w:tc>
+          <w:tcPr>
+            <w:tcW w:w="4740" w:type="dxa"/>
+          </w:tcPr>
+          <w:p>
+            <w:pPr>
+              <w:widowControl w:val="0"/>
+              <w:autoSpaceDE w:val="0"/>
+              <w:autoSpaceDN w:val="0"/>
+              <w:adjustRightInd w:val="0"/>
+              <w:spacing w:before="0" w:line="240" w:lineRule="auto"/>
+              <w:rPr>
+                <w:rFonts w:ascii="Latha" w:hAnsi="Latha" w:cs="Latha"/>
+                <w:sz w:val="28"/>
+                <w:szCs w:val="28"/>
+                <w:cs/>
+                <w:lang w:bidi="ta-IN"/>
+              </w:rPr>
+            </w:pPr>
+            <w:r>
+              <w:rPr>
+                <w:rFonts w:ascii="Latha" w:hAnsi="Latha" w:cs="Latha"/>
+                <w:sz w:val="28"/>
+                <w:szCs w:val="28"/>
+                <w:cs/>
+                <w:lang w:bidi="ta-IN"/>
+              </w:rPr>
+              <w:t>ஏ</w:t>
+            </w:r>
+            <w:r>
+              <w:rPr>
+                <w:rFonts w:ascii="BRH Tamil Tab Extra" w:hAnsi="BRH Tamil Tab Extra" w:cs="Latha"/>
+                <w:b/>
+                <w:sz w:val="32"/>
+                <w:szCs w:val="28"/>
+                <w:lang w:bidi="ta-IN"/>
+              </w:rPr>
+              <w:t>…</w:t>
+            </w:r>
+            <w:r>
+              <w:rPr>
+                <w:rFonts w:ascii="Latha" w:hAnsi="Latha" w:cs="Latha"/>
+                <w:sz w:val="28"/>
+                <w:szCs w:val="28"/>
+                <w:cs/>
+                <w:lang w:bidi="ta-IN"/>
+              </w:rPr>
+              <w:t>னோ</w:t>
+            </w:r>
+            <w:r>
+              <w:rPr>
+                <w:rFonts w:ascii="BRH Tamil Tab Extra" w:hAnsi="BRH Tamil Tab Extra" w:cs="Latha"/>
+                <w:b/>
+                <w:sz w:val="32"/>
+                <w:szCs w:val="28"/>
+                <w:lang w:bidi="ta-IN"/>
+              </w:rPr>
+              <w:t>…</w:t>
+            </w:r>
+            <w:r>
+              <w:rPr>
+                <w:rFonts w:ascii="BRH Tamil Tab Extra" w:hAnsi="BRH Tamil Tab Extra" w:cs="Latha"/>
+                <w:b/>
+                <w:sz w:val="32"/>
+                <w:szCs w:val="28"/>
+                <w:lang w:bidi="ta-IN"/>
+              </w:rPr>
+              <w:t xml:space="preserve"> </w:t>
+            </w:r>
+            <w:r>
+              <w:rPr>
+                <w:rFonts w:ascii="BRH Tamil Tab Extra" w:hAnsi="BRH Tamil Tab Extra" w:cs="Latha" w:hint="cs"/>
+                <w:b/>
+                <w:sz w:val="32"/>
+                <w:szCs w:val="28"/>
+                <w:highlight w:val="yellow"/>
+                <w:cs/>
+                <w:lang w:bidi="ta-IN"/>
+              </w:rPr>
+              <w:t>இ</w:t>
+            </w:r>
+            <w:r>
+              <w:rPr>
+                <w:rFonts w:ascii="Latha" w:hAnsi="Latha" w:cs="Latha"/>
+                <w:sz w:val="28"/>
+                <w:szCs w:val="28"/>
+                <w:highlight w:val="yellow"/>
+                <w:cs/>
+                <w:lang w:bidi="ta-IN"/>
+              </w:rPr>
+              <w:t>த்</w:t>
+            </w:r>
+            <w:r>
+              <w:rPr>
+                <w:rFonts w:ascii="Latha" w:hAnsi="Latha" w:cs="Latha"/>
+                <w:sz w:val="28"/>
+                <w:szCs w:val="28"/>
+                <w:cs/>
+                <w:lang w:bidi="ta-IN"/>
+              </w:rPr>
+              <w:t>யே</w:t>
+            </w:r>
+            <w:r>
+              <w:rPr>
+                <w:rFonts w:ascii="BRH Tamil Tab Extra" w:hAnsi="BRH Tamil Tab Extra" w:cs="Latha"/>
+                <w:b/>
+                <w:sz w:val="36"/>
+                <w:szCs w:val="28"/>
+                <w:lang w:bidi="ta-IN"/>
+              </w:rPr>
+              <w:t>†</w:t>
+            </w:r>
+            <w:r>
+              <w:rPr>
+                <w:rFonts w:ascii="Latha" w:hAnsi="Latha" w:cs="Latha"/>
+                <w:sz w:val="28"/>
+                <w:szCs w:val="28"/>
+                <w:cs/>
+                <w:lang w:bidi="ta-IN"/>
+              </w:rPr>
+              <w:t>னோ</w:t>
+            </w:r>
+            <w:r>
+              <w:rPr>
+                <w:rFonts w:ascii="Latha" w:hAnsi="Latha" w:cs="Latha"/>
+                <w:b/>
+                <w:bCs/>
+                <w:sz w:val="32"/>
+                <w:szCs w:val="32"/>
+                <w:cs/>
+                <w:lang w:bidi="ta-IN"/>
+              </w:rPr>
+              <w:t>:</w:t>
+            </w:r>
+          </w:p>
+        </w:tc>
+        <w:tc>
+          <w:tcPr>
+            <w:tcW w:w="5222" w:type="dxa"/>
+          </w:tcPr>
+          <w:p>
+            <w:pPr>
+              <w:widowControl w:val="0"/>
+              <w:autoSpaceDE w:val="0"/>
+              <w:autoSpaceDN w:val="0"/>
+              <w:adjustRightInd w:val="0"/>
+              <w:spacing w:before="0" w:line="240" w:lineRule="auto"/>
+              <w:rPr>
+                <w:rFonts w:ascii="Latha" w:hAnsi="Latha" w:cs="Latha"/>
+                <w:sz w:val="28"/>
+                <w:szCs w:val="28"/>
+                <w:cs/>
+                <w:lang w:bidi="ta-IN"/>
+              </w:rPr>
+            </w:pPr>
+            <w:r>
+              <w:rPr>
+                <w:rFonts w:ascii="Latha" w:hAnsi="Latha" w:cs="Latha"/>
+                <w:sz w:val="28"/>
+                <w:szCs w:val="28"/>
+                <w:cs/>
+                <w:lang w:bidi="ta-IN"/>
+              </w:rPr>
+              <w:t>ஏ</w:t>
+            </w:r>
+            <w:r>
+              <w:rPr>
+                <w:rFonts w:ascii="BRH Tamil Tab Extra" w:hAnsi="BRH Tamil Tab Extra" w:cs="Latha"/>
+                <w:b/>
+                <w:sz w:val="32"/>
+                <w:szCs w:val="28"/>
+                <w:lang w:bidi="ta-IN"/>
+              </w:rPr>
+              <w:t>…</w:t>
+            </w:r>
+            <w:r>
+              <w:rPr>
+                <w:rFonts w:ascii="Latha" w:hAnsi="Latha" w:cs="Latha"/>
+                <w:sz w:val="28"/>
+                <w:szCs w:val="28"/>
+                <w:cs/>
+                <w:lang w:bidi="ta-IN"/>
+              </w:rPr>
+              <w:t>னோ</w:t>
+            </w:r>
+            <w:r>
+              <w:rPr>
+                <w:rFonts w:ascii="BRH Tamil Tab Extra" w:hAnsi="BRH Tamil Tab Extra" w:cs="Latha"/>
+                <w:b/>
+                <w:sz w:val="32"/>
+                <w:szCs w:val="28"/>
+                <w:lang w:bidi="ta-IN"/>
+              </w:rPr>
+              <w:t>…</w:t>
+            </w:r>
+            <w:r>
+              <w:rPr>
+                <w:rFonts w:ascii="Latha" w:hAnsi="Latha" w:cs="Latha"/>
+                <w:sz w:val="28"/>
+                <w:szCs w:val="28"/>
+                <w:highlight w:val="green"/>
+                <w:cs/>
+                <w:lang w:bidi="ta-IN"/>
+              </w:rPr>
+              <w:t>ரி</w:t>
+            </w:r>
+            <w:r>
+              <w:rPr>
+                <w:rFonts w:ascii="Latha" w:hAnsi="Latha" w:cs="Latha"/>
+                <w:sz w:val="28"/>
+                <w:szCs w:val="28"/>
+                <w:cs/>
+                <w:lang w:bidi="ta-IN"/>
+              </w:rPr>
+              <w:t>த்யே</w:t>
+            </w:r>
+            <w:r>
+              <w:rPr>
+                <w:rFonts w:ascii="BRH Tamil Tab Extra" w:hAnsi="BRH Tamil Tab Extra" w:cs="Latha"/>
+                <w:b/>
+                <w:sz w:val="36"/>
+                <w:szCs w:val="28"/>
+                <w:lang w:bidi="ta-IN"/>
+              </w:rPr>
+              <w:t>†</w:t>
+            </w:r>
+            <w:r>
+              <w:rPr>
+                <w:rFonts w:ascii="Latha" w:hAnsi="Latha" w:cs="Latha"/>
+                <w:sz w:val="28"/>
+                <w:szCs w:val="28"/>
+                <w:cs/>
+                <w:lang w:bidi="ta-IN"/>
+              </w:rPr>
+              <w:t>னோ</w:t>
+            </w:r>
+            <w:r>
+              <w:rPr>
+                <w:rFonts w:ascii="Latha" w:hAnsi="Latha" w:cs="Latha"/>
+                <w:b/>
+                <w:bCs/>
+                <w:sz w:val="32"/>
+                <w:szCs w:val="32"/>
+                <w:cs/>
+                <w:lang w:bidi="ta-IN"/>
+              </w:rPr>
+              <w:t>:</w:t>
+            </w:r>
+          </w:p>
+        </w:tc>
+      </w:tr>
+      <w:tr>
+        <w:trPr>
+          <w:trHeight w:val="964"/>
+        </w:trPr>
+        <w:tc>
+          <w:tcPr>
+            <w:tcW w:w="3878" w:type="dxa"/>
+          </w:tcPr>
+          <w:p>
+            <w:pPr>
+              <w:widowControl w:val="0"/>
+              <w:tabs>
+                <w:tab w:val="left" w:pos="993"/>
+              </w:tabs>
+              <w:autoSpaceDE w:val="0"/>
+              <w:autoSpaceDN w:val="0"/>
+              <w:adjustRightInd w:val="0"/>
+              <w:spacing w:before="0" w:line="252" w:lineRule="auto"/>
+              <w:ind w:right="297"/>
+              <w:rPr>
+                <w:rFonts w:cs="Arial"/>
+                <w:b/>
+                <w:sz w:val="28"/>
+                <w:szCs w:val="28"/>
+              </w:rPr>
+            </w:pPr>
+            <w:r>
+              <w:rPr>
+                <w:rFonts w:cs="Arial"/>
+                <w:b/>
+                <w:sz w:val="28"/>
+                <w:szCs w:val="28"/>
+              </w:rPr>
+              <w:t>T.S.7.1.</w:t>
+            </w:r>
+            <w:r>
+              <w:rPr>
+                <w:rFonts w:cs="Arial"/>
+                <w:b/>
+                <w:sz w:val="28"/>
+                <w:szCs w:val="28"/>
+              </w:rPr>
+              <w:t>15</w:t>
+            </w:r>
+            <w:r>
+              <w:rPr>
+                <w:rFonts w:cs="Arial"/>
+                <w:b/>
+                <w:sz w:val="28"/>
+                <w:szCs w:val="28"/>
+              </w:rPr>
+              <w:t>.</w:t>
+            </w:r>
+            <w:r>
+              <w:rPr>
+                <w:rFonts w:cs="Arial"/>
+                <w:b/>
+                <w:sz w:val="28"/>
+                <w:szCs w:val="28"/>
+              </w:rPr>
+              <w:t>1</w:t>
+            </w:r>
+            <w:r>
+              <w:rPr>
+                <w:rFonts w:cs="Arial"/>
+                <w:b/>
+                <w:sz w:val="28"/>
+                <w:szCs w:val="28"/>
+              </w:rPr>
+              <w:t xml:space="preserve"> – Kramam</w:t>
+            </w:r>
+          </w:p>
+          <w:p>
+            <w:pPr>
+              <w:widowControl w:val="0"/>
+              <w:tabs>
+                <w:tab w:val="left" w:pos="993"/>
+              </w:tabs>
+              <w:autoSpaceDE w:val="0"/>
+              <w:autoSpaceDN w:val="0"/>
+              <w:adjustRightInd w:val="0"/>
+              <w:spacing w:before="0" w:line="252" w:lineRule="auto"/>
+              <w:ind w:right="297"/>
+              <w:rPr>
+                <w:rFonts w:cs="Arial"/>
+                <w:b/>
+                <w:sz w:val="28"/>
+                <w:szCs w:val="28"/>
+              </w:rPr>
+            </w:pPr>
+            <w:r>
+              <w:rPr>
+                <w:rFonts w:cs="Arial"/>
+                <w:b/>
+                <w:sz w:val="28"/>
+                <w:szCs w:val="28"/>
+              </w:rPr>
+              <w:t xml:space="preserve">Krama Vaakyam No.– </w:t>
+            </w:r>
+            <w:r>
+              <w:rPr>
+                <w:rFonts w:cs="Arial"/>
+                <w:b/>
+                <w:sz w:val="28"/>
+                <w:szCs w:val="28"/>
+              </w:rPr>
+              <w:t>42 ,43 and 44</w:t>
+            </w:r>
+          </w:p>
+          <w:p>
+            <w:pPr>
+              <w:widowControl w:val="0"/>
+              <w:tabs>
+                <w:tab w:val="left" w:pos="993"/>
+              </w:tabs>
+              <w:autoSpaceDE w:val="0"/>
+              <w:autoSpaceDN w:val="0"/>
+              <w:adjustRightInd w:val="0"/>
+              <w:spacing w:before="0" w:line="252" w:lineRule="auto"/>
+              <w:ind w:right="297"/>
+              <w:rPr>
+                <w:rFonts w:cs="Arial"/>
+                <w:b/>
+                <w:sz w:val="28"/>
+                <w:szCs w:val="28"/>
+              </w:rPr>
+            </w:pPr>
+            <w:r>
+              <w:rPr>
+                <w:rFonts w:cs="Arial"/>
+                <w:b/>
+                <w:sz w:val="28"/>
+                <w:szCs w:val="28"/>
+              </w:rPr>
+              <w:t xml:space="preserve">Panchaati No. - </w:t>
+            </w:r>
+            <w:r>
+              <w:rPr>
+                <w:rFonts w:cs="Arial"/>
+                <w:b/>
+                <w:sz w:val="28"/>
+                <w:szCs w:val="28"/>
+              </w:rPr>
+              <w:t>44</w:t>
+            </w:r>
+          </w:p>
+        </w:tc>
+        <w:tc>
+          <w:tcPr>
+            <w:tcW w:w="4740" w:type="dxa"/>
+          </w:tcPr>
+          <w:p>
+            <w:pPr>
+              <w:autoSpaceDE w:val="0"/>
+              <w:autoSpaceDN w:val="0"/>
+              <w:adjustRightInd w:val="0"/>
+              <w:spacing w:line="252" w:lineRule="auto"/>
+              <w:rPr>
+                <w:rFonts w:ascii="Latha" w:hAnsi="Latha" w:cs="Latha"/>
+                <w:sz w:val="28"/>
+                <w:szCs w:val="28"/>
+                <w:lang w:bidi="ta-IN"/>
+              </w:rPr>
+            </w:pPr>
+            <w:r>
+              <w:rPr>
+                <w:rFonts w:ascii="Latha" w:hAnsi="Latha" w:cs="Latha"/>
+                <w:sz w:val="28"/>
+                <w:szCs w:val="28"/>
+                <w:cs/>
+                <w:lang w:bidi="ta-IN"/>
+              </w:rPr>
+              <w:t>ஸ்வாஹா</w:t>
+            </w:r>
+            <w:r>
+              <w:rPr>
+                <w:rFonts w:ascii="BRH Tamil Tab Extra" w:hAnsi="BRH Tamil Tab Extra" w:cs="Latha"/>
+                <w:b/>
+                <w:sz w:val="36"/>
+                <w:szCs w:val="28"/>
+                <w:lang w:bidi="ta-IN"/>
+              </w:rPr>
+              <w:t>‡</w:t>
+            </w:r>
+            <w:r>
+              <w:rPr>
+                <w:rFonts w:ascii="BRH Devanagari Extra" w:hAnsi="BRH Devanagari Extra" w:cs="Latha"/>
+                <w:b/>
+                <w:sz w:val="36"/>
+                <w:szCs w:val="28"/>
+                <w:lang w:bidi="ta-IN"/>
+              </w:rPr>
+              <w:t>Å</w:t>
+            </w:r>
+            <w:r>
+              <w:rPr>
+                <w:rFonts w:ascii="Latha" w:hAnsi="Latha" w:cs="Latha"/>
+                <w:sz w:val="28"/>
+                <w:szCs w:val="28"/>
+                <w:cs/>
+                <w:lang w:bidi="ta-IN"/>
+              </w:rPr>
+              <w:t>ர்</w:t>
+            </w:r>
+            <w:r>
+              <w:rPr>
+                <w:rFonts w:ascii="Latha" w:hAnsi="Latha" w:cs="Latha"/>
+                <w:sz w:val="28"/>
+                <w:szCs w:val="28"/>
+                <w:highlight w:val="yellow"/>
+                <w:cs/>
+                <w:lang w:bidi="ta-IN"/>
+              </w:rPr>
+              <w:t>த</w:t>
+            </w:r>
+            <w:r>
+              <w:rPr>
+                <w:rFonts w:ascii="Latha" w:hAnsi="Latha" w:cs="Latha" w:hint="cs"/>
+                <w:b/>
+                <w:bCs/>
+                <w:position w:val="-12"/>
+                <w:sz w:val="28"/>
+                <w:szCs w:val="28"/>
+                <w:highlight w:val="yellow"/>
+                <w:cs/>
+                <w:lang w:bidi="ta-IN"/>
+              </w:rPr>
+              <w:t>3</w:t>
+            </w:r>
+            <w:r>
+              <w:rPr>
+                <w:rFonts w:ascii="Latha" w:hAnsi="Latha" w:cs="Latha"/>
+                <w:sz w:val="28"/>
+                <w:szCs w:val="28"/>
+                <w:highlight w:val="yellow"/>
+                <w:cs/>
+                <w:lang w:bidi="ta-IN"/>
+              </w:rPr>
+              <w:t>த</w:t>
+            </w:r>
+            <w:r>
+              <w:rPr>
+                <w:rFonts w:ascii="Latha" w:hAnsi="Latha" w:cs="Latha"/>
+                <w:b/>
+                <w:bCs/>
+                <w:position w:val="-12"/>
+                <w:sz w:val="28"/>
+                <w:szCs w:val="28"/>
+                <w:highlight w:val="yellow"/>
+                <w:cs/>
+                <w:lang w:bidi="ta-IN"/>
+              </w:rPr>
+              <w:t>4</w:t>
+            </w:r>
+            <w:r>
+              <w:rPr>
+                <w:rFonts w:ascii="Latha" w:hAnsi="Latha" w:cs="Latha"/>
+                <w:sz w:val="28"/>
+                <w:szCs w:val="28"/>
+                <w:cs/>
+                <w:lang w:bidi="ta-IN"/>
+              </w:rPr>
+              <w:t>மா</w:t>
+            </w:r>
+            <w:r>
+              <w:rPr>
+                <w:rFonts w:ascii="BRH Tamil Tab Extra" w:hAnsi="BRH Tamil Tab Extra" w:cs="Latha"/>
+                <w:b/>
+                <w:sz w:val="32"/>
+                <w:szCs w:val="28"/>
+                <w:lang w:bidi="ta-IN"/>
+              </w:rPr>
+              <w:t>…</w:t>
+            </w:r>
+            <w:r>
+              <w:rPr>
+                <w:rFonts w:ascii="Latha" w:hAnsi="Latha" w:cs="Latha"/>
+                <w:sz w:val="28"/>
+                <w:szCs w:val="28"/>
+                <w:cs/>
+                <w:lang w:bidi="ta-IN"/>
+              </w:rPr>
+              <w:t>ஸேப்</w:t>
+            </w:r>
+            <w:r>
+              <w:rPr>
+                <w:rFonts w:ascii="Latha" w:hAnsi="Latha" w:cs="Latha"/>
+                <w:b/>
+                <w:bCs/>
+                <w:position w:val="-12"/>
+                <w:sz w:val="28"/>
+                <w:szCs w:val="28"/>
+                <w:cs/>
+                <w:lang w:bidi="ta-IN"/>
+              </w:rPr>
+              <w:t>4</w:t>
+            </w:r>
+            <w:r>
+              <w:rPr>
+                <w:rFonts w:ascii="Latha" w:hAnsi="Latha" w:cs="Latha"/>
+                <w:sz w:val="28"/>
+                <w:szCs w:val="28"/>
+                <w:cs/>
+                <w:lang w:bidi="ta-IN"/>
+              </w:rPr>
+              <w:t>ய</w:t>
+            </w:r>
+            <w:r>
+              <w:rPr>
+                <w:rFonts w:ascii="BRH Tamil Tab Extra" w:hAnsi="BRH Tamil Tab Extra" w:cs="Latha"/>
+                <w:b/>
+                <w:sz w:val="36"/>
+                <w:szCs w:val="28"/>
+                <w:lang w:bidi="ta-IN"/>
+              </w:rPr>
+              <w:t>†</w:t>
+            </w:r>
+            <w:r>
+              <w:rPr>
+                <w:rFonts w:ascii="Latha" w:hAnsi="Latha" w:cs="Latha"/>
+                <w:b/>
+                <w:bCs/>
+                <w:sz w:val="32"/>
+                <w:szCs w:val="32"/>
+                <w:cs/>
+                <w:lang w:bidi="ta-IN"/>
+              </w:rPr>
+              <w:t>:</w:t>
+            </w:r>
+            <w:r>
+              <w:rPr>
+                <w:rFonts w:ascii="Latha" w:hAnsi="Latha" w:cs="Latha"/>
+                <w:sz w:val="28"/>
+                <w:szCs w:val="28"/>
+                <w:lang w:bidi="ta-IN"/>
+              </w:rPr>
+              <w:t xml:space="preserve"> | </w:t>
+            </w:r>
+            <w:r>
+              <w:rPr>
+                <w:rFonts w:ascii="Latha" w:hAnsi="Latha" w:cs="Latha"/>
+                <w:sz w:val="28"/>
+                <w:szCs w:val="28"/>
+                <w:cs/>
+                <w:lang w:bidi="ta-IN"/>
+              </w:rPr>
+              <w:t>அ</w:t>
+            </w:r>
+            <w:r>
+              <w:rPr>
+                <w:rFonts w:ascii="BRH Tamil Tab Extra" w:hAnsi="BRH Tamil Tab Extra" w:cs="Latha"/>
+                <w:b/>
+                <w:sz w:val="32"/>
+                <w:szCs w:val="28"/>
+                <w:lang w:bidi="ta-IN"/>
+              </w:rPr>
+              <w:t>…</w:t>
+            </w:r>
+            <w:r>
+              <w:rPr>
+                <w:rFonts w:ascii="Latha" w:hAnsi="Latha" w:cs="Latha"/>
+                <w:sz w:val="28"/>
+                <w:szCs w:val="28"/>
+                <w:cs/>
+                <w:lang w:bidi="ta-IN"/>
+              </w:rPr>
+              <w:t>ர்</w:t>
+            </w:r>
+            <w:r>
+              <w:rPr>
+                <w:rFonts w:ascii="Latha" w:hAnsi="Latha" w:cs="Latha"/>
+                <w:sz w:val="28"/>
+                <w:szCs w:val="28"/>
+                <w:highlight w:val="yellow"/>
+                <w:cs/>
+                <w:lang w:bidi="ta-IN"/>
+              </w:rPr>
+              <w:t>த</w:t>
+            </w:r>
+            <w:r>
+              <w:rPr>
+                <w:rFonts w:ascii="Latha" w:hAnsi="Latha" w:cs="Latha" w:hint="cs"/>
+                <w:b/>
+                <w:bCs/>
+                <w:position w:val="-12"/>
+                <w:sz w:val="28"/>
+                <w:szCs w:val="28"/>
+                <w:highlight w:val="yellow"/>
+                <w:cs/>
+                <w:lang w:bidi="ta-IN"/>
+              </w:rPr>
+              <w:t>3</w:t>
+            </w:r>
+            <w:r>
+              <w:rPr>
+                <w:rFonts w:ascii="Latha" w:hAnsi="Latha" w:cs="Latha"/>
+                <w:sz w:val="28"/>
+                <w:szCs w:val="28"/>
+                <w:highlight w:val="yellow"/>
+                <w:cs/>
+                <w:lang w:bidi="ta-IN"/>
+              </w:rPr>
+              <w:t>த</w:t>
+            </w:r>
+            <w:r>
+              <w:rPr>
+                <w:rFonts w:ascii="BRH Tamil Tab Extra" w:hAnsi="BRH Tamil Tab Extra" w:cs="Latha"/>
+                <w:b/>
+                <w:sz w:val="32"/>
+                <w:szCs w:val="28"/>
+                <w:highlight w:val="yellow"/>
+                <w:lang w:bidi="ta-IN"/>
+              </w:rPr>
+              <w:t>…</w:t>
+            </w:r>
+            <w:r>
+              <w:rPr>
+                <w:rFonts w:ascii="Latha" w:hAnsi="Latha" w:cs="Latha"/>
+                <w:b/>
+                <w:bCs/>
+                <w:position w:val="-12"/>
+                <w:sz w:val="28"/>
+                <w:szCs w:val="28"/>
+                <w:highlight w:val="yellow"/>
+                <w:cs/>
+                <w:lang w:bidi="ta-IN"/>
+              </w:rPr>
+              <w:t>4</w:t>
+            </w:r>
+            <w:r>
+              <w:rPr>
+                <w:rFonts w:ascii="Latha" w:hAnsi="Latha" w:cs="Latha"/>
+                <w:sz w:val="28"/>
+                <w:szCs w:val="28"/>
+                <w:cs/>
+                <w:lang w:bidi="ta-IN"/>
+              </w:rPr>
+              <w:t>மா</w:t>
+            </w:r>
+            <w:r>
+              <w:rPr>
+                <w:rFonts w:ascii="BRH Tamil Tab Extra" w:hAnsi="BRH Tamil Tab Extra" w:cs="Latha"/>
+                <w:b/>
+                <w:sz w:val="32"/>
+                <w:szCs w:val="28"/>
+                <w:lang w:bidi="ta-IN"/>
+              </w:rPr>
+              <w:t>…</w:t>
+            </w:r>
+            <w:r>
+              <w:rPr>
+                <w:rFonts w:ascii="Latha" w:hAnsi="Latha" w:cs="Latha"/>
+                <w:sz w:val="28"/>
+                <w:szCs w:val="28"/>
+                <w:cs/>
+                <w:lang w:bidi="ta-IN"/>
+              </w:rPr>
+              <w:t>ஸேப்</w:t>
+            </w:r>
+            <w:r>
+              <w:rPr>
+                <w:rFonts w:ascii="Latha" w:hAnsi="Latha" w:cs="Latha"/>
+                <w:b/>
+                <w:bCs/>
+                <w:position w:val="-12"/>
+                <w:sz w:val="28"/>
+                <w:szCs w:val="28"/>
+                <w:cs/>
+                <w:lang w:bidi="ta-IN"/>
+              </w:rPr>
+              <w:t>4</w:t>
+            </w:r>
+            <w:r>
+              <w:rPr>
+                <w:rFonts w:ascii="Latha" w:hAnsi="Latha" w:cs="Latha"/>
+                <w:sz w:val="28"/>
+                <w:szCs w:val="28"/>
+                <w:cs/>
+                <w:lang w:bidi="ta-IN"/>
+              </w:rPr>
+              <w:t>ய</w:t>
+            </w:r>
+            <w:r>
+              <w:rPr>
+                <w:rFonts w:ascii="BRH Tamil Tab Extra" w:hAnsi="BRH Tamil Tab Extra" w:cs="Latha"/>
+                <w:b/>
+                <w:sz w:val="32"/>
+                <w:szCs w:val="28"/>
+                <w:lang w:bidi="ta-IN"/>
+              </w:rPr>
+              <w:t>…</w:t>
+            </w:r>
+            <w:r>
+              <w:rPr>
+                <w:rFonts w:ascii="Latha" w:hAnsi="Latha" w:cs="Latha"/>
+                <w:b/>
+                <w:bCs/>
+                <w:sz w:val="32"/>
+                <w:szCs w:val="32"/>
+                <w:cs/>
+                <w:lang w:bidi="ta-IN"/>
+              </w:rPr>
+              <w:t>:</w:t>
+            </w:r>
+            <w:r>
+              <w:rPr>
+                <w:rFonts w:ascii="Latha" w:hAnsi="Latha" w:cs="Latha"/>
+                <w:sz w:val="28"/>
+                <w:szCs w:val="28"/>
+                <w:lang w:bidi="ta-IN"/>
+              </w:rPr>
+              <w:t xml:space="preserve"> </w:t>
+            </w:r>
+            <w:r>
+              <w:rPr>
+                <w:rFonts w:ascii="Latha" w:hAnsi="Latha" w:cs="Latha"/>
+                <w:sz w:val="28"/>
+                <w:szCs w:val="28"/>
+                <w:cs/>
+                <w:lang w:bidi="ta-IN"/>
+              </w:rPr>
+              <w:t>ஸ்வாஹா</w:t>
+            </w:r>
+            <w:r>
+              <w:rPr>
+                <w:rFonts w:ascii="BRH Tamil Tab Extra" w:hAnsi="BRH Tamil Tab Extra" w:cs="Latha"/>
+                <w:b/>
+                <w:sz w:val="36"/>
+                <w:szCs w:val="28"/>
+                <w:lang w:bidi="ta-IN"/>
+              </w:rPr>
+              <w:t>‡</w:t>
+            </w:r>
+            <w:r>
+              <w:rPr>
+                <w:rFonts w:ascii="Latha" w:hAnsi="Latha" w:cs="Latha"/>
+                <w:sz w:val="28"/>
+                <w:szCs w:val="28"/>
+                <w:lang w:bidi="ta-IN"/>
+              </w:rPr>
+              <w:t xml:space="preserve"> | </w:t>
+            </w:r>
+          </w:p>
+          <w:p>
+            <w:pPr>
+              <w:widowControl w:val="0"/>
+              <w:autoSpaceDE w:val="0"/>
+              <w:autoSpaceDN w:val="0"/>
+              <w:adjustRightInd w:val="0"/>
+              <w:spacing w:before="0" w:line="240" w:lineRule="auto"/>
+              <w:rPr>
+                <w:rFonts w:ascii="Latha" w:hAnsi="Latha" w:cs="Latha"/>
+                <w:sz w:val="28"/>
+                <w:szCs w:val="28"/>
+                <w:cs/>
+                <w:lang w:bidi="ta-IN"/>
+              </w:rPr>
+            </w:pPr>
+            <w:r>
+              <w:rPr>
+                <w:rFonts w:ascii="Latha" w:hAnsi="Latha" w:cs="Latha"/>
+                <w:sz w:val="28"/>
+                <w:szCs w:val="28"/>
+                <w:cs/>
+                <w:lang w:bidi="ta-IN"/>
+              </w:rPr>
+              <w:t>அ</w:t>
+            </w:r>
+            <w:r>
+              <w:rPr>
+                <w:rFonts w:ascii="BRH Tamil Tab Extra" w:hAnsi="BRH Tamil Tab Extra" w:cs="Latha"/>
+                <w:b/>
+                <w:sz w:val="32"/>
+                <w:szCs w:val="28"/>
+                <w:lang w:bidi="ta-IN"/>
+              </w:rPr>
+              <w:t>…</w:t>
+            </w:r>
+            <w:r>
+              <w:rPr>
+                <w:rFonts w:ascii="Latha" w:hAnsi="Latha" w:cs="Latha"/>
+                <w:sz w:val="28"/>
+                <w:szCs w:val="28"/>
+                <w:cs/>
+                <w:lang w:bidi="ta-IN"/>
+              </w:rPr>
+              <w:t>ர்</w:t>
+            </w:r>
+            <w:r>
+              <w:rPr>
+                <w:rFonts w:ascii="Latha" w:hAnsi="Latha" w:cs="Latha"/>
+                <w:sz w:val="28"/>
+                <w:szCs w:val="28"/>
+                <w:highlight w:val="yellow"/>
+                <w:cs/>
+                <w:lang w:bidi="ta-IN"/>
+              </w:rPr>
+              <w:t>த</w:t>
+            </w:r>
+            <w:r>
+              <w:rPr>
+                <w:rFonts w:ascii="Latha" w:hAnsi="Latha" w:cs="Latha" w:hint="cs"/>
+                <w:b/>
+                <w:bCs/>
+                <w:position w:val="-12"/>
+                <w:sz w:val="28"/>
+                <w:szCs w:val="28"/>
+                <w:highlight w:val="yellow"/>
+                <w:cs/>
+                <w:lang w:bidi="ta-IN"/>
+              </w:rPr>
+              <w:t>3</w:t>
+            </w:r>
+            <w:r>
+              <w:rPr>
+                <w:rFonts w:ascii="Latha" w:hAnsi="Latha" w:cs="Latha"/>
+                <w:sz w:val="28"/>
+                <w:szCs w:val="28"/>
+                <w:highlight w:val="yellow"/>
+                <w:cs/>
+                <w:lang w:bidi="ta-IN"/>
+              </w:rPr>
+              <w:t>த</w:t>
+            </w:r>
+            <w:r>
+              <w:rPr>
+                <w:rFonts w:ascii="BRH Tamil Tab Extra" w:hAnsi="BRH Tamil Tab Extra" w:cs="Latha"/>
+                <w:b/>
+                <w:sz w:val="32"/>
+                <w:szCs w:val="28"/>
+                <w:highlight w:val="yellow"/>
+                <w:lang w:bidi="ta-IN"/>
+              </w:rPr>
+              <w:t>…</w:t>
+            </w:r>
+            <w:r>
+              <w:rPr>
+                <w:rFonts w:ascii="Latha" w:hAnsi="Latha" w:cs="Latha"/>
+                <w:b/>
+                <w:bCs/>
+                <w:position w:val="-12"/>
+                <w:sz w:val="28"/>
+                <w:szCs w:val="28"/>
+                <w:cs/>
+                <w:lang w:bidi="ta-IN"/>
+              </w:rPr>
+              <w:t>4</w:t>
+            </w:r>
+            <w:r>
+              <w:rPr>
+                <w:rFonts w:ascii="Latha" w:hAnsi="Latha" w:cs="Latha"/>
+                <w:sz w:val="28"/>
+                <w:szCs w:val="28"/>
+                <w:cs/>
+                <w:lang w:bidi="ta-IN"/>
+              </w:rPr>
+              <w:t>மா</w:t>
+            </w:r>
+            <w:r>
+              <w:rPr>
+                <w:rFonts w:ascii="BRH Tamil Tab Extra" w:hAnsi="BRH Tamil Tab Extra" w:cs="Latha"/>
+                <w:b/>
+                <w:sz w:val="32"/>
+                <w:szCs w:val="28"/>
+                <w:lang w:bidi="ta-IN"/>
+              </w:rPr>
+              <w:t>…</w:t>
+            </w:r>
+            <w:r>
+              <w:rPr>
+                <w:rFonts w:ascii="Latha" w:hAnsi="Latha" w:cs="Latha"/>
+                <w:sz w:val="28"/>
+                <w:szCs w:val="28"/>
+                <w:cs/>
+                <w:lang w:bidi="ta-IN"/>
+              </w:rPr>
+              <w:t>ஸேப்</w:t>
+            </w:r>
+            <w:r>
+              <w:rPr>
+                <w:rFonts w:ascii="Latha" w:hAnsi="Latha" w:cs="Latha"/>
+                <w:b/>
+                <w:bCs/>
+                <w:position w:val="-12"/>
+                <w:sz w:val="28"/>
+                <w:szCs w:val="28"/>
+                <w:cs/>
+                <w:lang w:bidi="ta-IN"/>
+              </w:rPr>
+              <w:t>4</w:t>
+            </w:r>
+            <w:r>
+              <w:rPr>
+                <w:rFonts w:ascii="Latha" w:hAnsi="Latha" w:cs="Latha"/>
+                <w:sz w:val="28"/>
+                <w:szCs w:val="28"/>
+                <w:cs/>
+                <w:lang w:bidi="ta-IN"/>
+              </w:rPr>
+              <w:t>ய</w:t>
+            </w:r>
+            <w:r>
+              <w:rPr>
+                <w:rFonts w:ascii="BRH Tamil Tab Extra" w:hAnsi="BRH Tamil Tab Extra" w:cs="Latha"/>
+                <w:b/>
+                <w:sz w:val="32"/>
+                <w:szCs w:val="28"/>
+                <w:lang w:bidi="ta-IN"/>
+              </w:rPr>
+              <w:t>…</w:t>
+            </w:r>
+            <w:r>
+              <w:rPr>
+                <w:rFonts w:ascii="Latha" w:hAnsi="Latha" w:cs="Latha"/>
+                <w:sz w:val="28"/>
+                <w:szCs w:val="28"/>
+                <w:lang w:bidi="ta-IN"/>
+              </w:rPr>
+              <w:t xml:space="preserve"> </w:t>
+            </w:r>
+            <w:r>
+              <w:rPr>
+                <w:rFonts w:ascii="Latha" w:hAnsi="Latha" w:cs="Latha"/>
+                <w:sz w:val="28"/>
+                <w:szCs w:val="28"/>
+                <w:cs/>
+                <w:lang w:bidi="ta-IN"/>
+              </w:rPr>
+              <w:t>இத்ய</w:t>
+            </w:r>
+            <w:r>
+              <w:rPr>
+                <w:rFonts w:ascii="BRH Tamil Tab Extra" w:hAnsi="BRH Tamil Tab Extra" w:cs="Latha"/>
+                <w:b/>
+                <w:sz w:val="36"/>
+                <w:szCs w:val="28"/>
+                <w:lang w:bidi="ta-IN"/>
+              </w:rPr>
+              <w:t>†</w:t>
+            </w:r>
+            <w:r>
+              <w:rPr>
+                <w:rFonts w:ascii="Latha" w:hAnsi="Latha" w:cs="Latha"/>
+                <w:sz w:val="28"/>
+                <w:szCs w:val="28"/>
+                <w:cs/>
+                <w:lang w:bidi="ta-IN"/>
+              </w:rPr>
+              <w:t>ர்</w:t>
+            </w:r>
+            <w:r>
+              <w:rPr>
+                <w:rFonts w:ascii="Latha" w:hAnsi="Latha" w:cs="Latha"/>
+                <w:sz w:val="28"/>
+                <w:szCs w:val="28"/>
+                <w:highlight w:val="yellow"/>
+                <w:cs/>
+                <w:lang w:bidi="ta-IN"/>
+              </w:rPr>
+              <w:t>த</w:t>
+            </w:r>
+            <w:r>
+              <w:rPr>
+                <w:rFonts w:ascii="Latha" w:hAnsi="Latha" w:cs="Latha" w:hint="cs"/>
+                <w:b/>
+                <w:bCs/>
+                <w:position w:val="-12"/>
+                <w:sz w:val="28"/>
+                <w:szCs w:val="28"/>
+                <w:highlight w:val="yellow"/>
+                <w:cs/>
+                <w:lang w:bidi="ta-IN"/>
+              </w:rPr>
+              <w:t>3</w:t>
+            </w:r>
+            <w:r>
+              <w:rPr>
+                <w:rFonts w:ascii="Latha" w:hAnsi="Latha" w:cs="Latha"/>
+                <w:sz w:val="28"/>
+                <w:szCs w:val="28"/>
+                <w:highlight w:val="yellow"/>
+                <w:cs/>
+                <w:lang w:bidi="ta-IN"/>
+              </w:rPr>
+              <w:t>த</w:t>
+            </w:r>
+            <w:r>
+              <w:rPr>
+                <w:rFonts w:ascii="Latha" w:hAnsi="Latha" w:cs="Latha"/>
+                <w:b/>
+                <w:bCs/>
+                <w:position w:val="-12"/>
+                <w:sz w:val="28"/>
+                <w:szCs w:val="28"/>
+                <w:highlight w:val="yellow"/>
+                <w:cs/>
+                <w:lang w:bidi="ta-IN"/>
+              </w:rPr>
+              <w:t>4</w:t>
+            </w:r>
+            <w:r>
+              <w:rPr>
+                <w:rFonts w:ascii="Latha" w:hAnsi="Latha" w:cs="Latha"/>
+                <w:sz w:val="28"/>
+                <w:szCs w:val="28"/>
+                <w:lang w:bidi="ta-IN"/>
+              </w:rPr>
+              <w:t xml:space="preserve"> - </w:t>
+            </w:r>
+            <w:r>
+              <w:rPr>
+                <w:rFonts w:ascii="Latha" w:hAnsi="Latha" w:cs="Latha"/>
+                <w:sz w:val="28"/>
+                <w:szCs w:val="28"/>
+                <w:cs/>
+                <w:lang w:bidi="ta-IN"/>
+              </w:rPr>
+              <w:t>மா</w:t>
+            </w:r>
+            <w:r>
+              <w:rPr>
+                <w:rFonts w:ascii="BRH Tamil Tab Extra" w:hAnsi="BRH Tamil Tab Extra" w:cs="Latha"/>
+                <w:b/>
+                <w:sz w:val="32"/>
+                <w:szCs w:val="28"/>
+                <w:lang w:bidi="ta-IN"/>
+              </w:rPr>
+              <w:t>…</w:t>
+            </w:r>
+            <w:r>
+              <w:rPr>
+                <w:rFonts w:ascii="Latha" w:hAnsi="Latha" w:cs="Latha"/>
+                <w:sz w:val="28"/>
+                <w:szCs w:val="28"/>
+                <w:cs/>
+                <w:lang w:bidi="ta-IN"/>
+              </w:rPr>
+              <w:t>ஸேப்</w:t>
+            </w:r>
+            <w:r>
+              <w:rPr>
+                <w:rFonts w:ascii="Latha" w:hAnsi="Latha" w:cs="Latha"/>
+                <w:b/>
+                <w:bCs/>
+                <w:position w:val="-12"/>
+                <w:sz w:val="28"/>
+                <w:szCs w:val="28"/>
+                <w:cs/>
+                <w:lang w:bidi="ta-IN"/>
+              </w:rPr>
+              <w:t>4</w:t>
+            </w:r>
+            <w:r>
+              <w:rPr>
+                <w:rFonts w:ascii="Latha" w:hAnsi="Latha" w:cs="Latha"/>
+                <w:sz w:val="28"/>
+                <w:szCs w:val="28"/>
+                <w:cs/>
+                <w:lang w:bidi="ta-IN"/>
+              </w:rPr>
+              <w:t>ய</w:t>
+            </w:r>
+            <w:r>
+              <w:rPr>
+                <w:rFonts w:ascii="BRH Tamil Tab Extra" w:hAnsi="BRH Tamil Tab Extra" w:cs="Latha"/>
+                <w:b/>
+                <w:sz w:val="36"/>
+                <w:szCs w:val="28"/>
+                <w:lang w:bidi="ta-IN"/>
+              </w:rPr>
+              <w:t>†</w:t>
+            </w:r>
+            <w:r>
+              <w:rPr>
+                <w:rFonts w:ascii="Latha" w:hAnsi="Latha" w:cs="Latha"/>
+                <w:b/>
+                <w:bCs/>
+                <w:sz w:val="32"/>
+                <w:szCs w:val="32"/>
+                <w:cs/>
+                <w:lang w:bidi="ta-IN"/>
+              </w:rPr>
+              <w:t>:</w:t>
+            </w:r>
+            <w:r>
+              <w:rPr>
+                <w:rFonts w:ascii="Latha" w:hAnsi="Latha" w:cs="Latha"/>
+                <w:sz w:val="28"/>
+                <w:szCs w:val="28"/>
+                <w:lang w:bidi="ta-IN"/>
+              </w:rPr>
+              <w:t xml:space="preserve"> |</w:t>
+            </w:r>
+          </w:p>
+        </w:tc>
+        <w:tc>
+          <w:tcPr>
+            <w:tcW w:w="5222" w:type="dxa"/>
+          </w:tcPr>
+          <w:p>
+            <w:pPr>
+              <w:autoSpaceDE w:val="0"/>
+              <w:autoSpaceDN w:val="0"/>
+              <w:adjustRightInd w:val="0"/>
+              <w:spacing w:line="252" w:lineRule="auto"/>
+              <w:rPr>
+                <w:rFonts w:ascii="Latha" w:hAnsi="Latha" w:cs="Latha"/>
+                <w:sz w:val="28"/>
+                <w:szCs w:val="28"/>
+                <w:lang w:bidi="ta-IN"/>
+              </w:rPr>
+            </w:pPr>
+            <w:r>
+              <w:rPr>
+                <w:rFonts w:ascii="Latha" w:hAnsi="Latha" w:cs="Latha"/>
+                <w:sz w:val="28"/>
+                <w:szCs w:val="28"/>
+                <w:cs/>
+                <w:lang w:bidi="ta-IN"/>
+              </w:rPr>
+              <w:t>ஸ்வாஹா</w:t>
+            </w:r>
+            <w:r>
+              <w:rPr>
+                <w:rFonts w:ascii="BRH Tamil Tab Extra" w:hAnsi="BRH Tamil Tab Extra" w:cs="Latha"/>
+                <w:b/>
+                <w:sz w:val="36"/>
+                <w:szCs w:val="28"/>
+                <w:lang w:bidi="ta-IN"/>
+              </w:rPr>
+              <w:t>‡</w:t>
+            </w:r>
+            <w:r>
+              <w:rPr>
+                <w:rFonts w:ascii="BRH Devanagari Extra" w:hAnsi="BRH Devanagari Extra" w:cs="Latha"/>
+                <w:b/>
+                <w:sz w:val="36"/>
+                <w:szCs w:val="28"/>
+                <w:lang w:bidi="ta-IN"/>
+              </w:rPr>
+              <w:t>Å</w:t>
+            </w:r>
+            <w:r>
+              <w:rPr>
+                <w:rFonts w:ascii="Latha" w:hAnsi="Latha" w:cs="Latha"/>
+                <w:sz w:val="28"/>
+                <w:szCs w:val="28"/>
+                <w:cs/>
+                <w:lang w:bidi="ta-IN"/>
+              </w:rPr>
+              <w:t>ர்</w:t>
+            </w:r>
+            <w:r>
+              <w:rPr>
+                <w:rFonts w:ascii="Latha" w:hAnsi="Latha" w:cs="Latha" w:hint="cs"/>
+                <w:sz w:val="28"/>
+                <w:szCs w:val="28"/>
+                <w:highlight w:val="green"/>
+                <w:cs/>
+                <w:lang w:bidi="ta-IN"/>
+              </w:rPr>
+              <w:t>த்</w:t>
+            </w:r>
+            <w:r>
+              <w:rPr>
+                <w:rFonts w:ascii="Latha" w:hAnsi="Latha" w:cs="Latha" w:hint="cs"/>
+                <w:b/>
+                <w:bCs/>
+                <w:position w:val="-12"/>
+                <w:sz w:val="28"/>
+                <w:szCs w:val="28"/>
+                <w:highlight w:val="green"/>
+                <w:cs/>
+                <w:lang w:bidi="ta-IN"/>
+              </w:rPr>
+              <w:t>3</w:t>
+            </w:r>
+            <w:r>
+              <w:rPr>
+                <w:rFonts w:ascii="Latha" w:hAnsi="Latha" w:cs="Latha"/>
+                <w:sz w:val="28"/>
+                <w:szCs w:val="28"/>
+                <w:highlight w:val="green"/>
+                <w:cs/>
+                <w:lang w:bidi="ta-IN"/>
+              </w:rPr>
+              <w:t>த</w:t>
+            </w:r>
+            <w:r>
+              <w:rPr>
+                <w:rFonts w:ascii="Latha" w:hAnsi="Latha" w:cs="Latha"/>
+                <w:b/>
+                <w:bCs/>
+                <w:position w:val="-12"/>
+                <w:sz w:val="28"/>
+                <w:szCs w:val="28"/>
+                <w:highlight w:val="green"/>
+                <w:cs/>
+                <w:lang w:bidi="ta-IN"/>
+              </w:rPr>
+              <w:t>4</w:t>
+            </w:r>
+            <w:r>
+              <w:rPr>
+                <w:rFonts w:ascii="Latha" w:hAnsi="Latha" w:cs="Latha"/>
+                <w:sz w:val="28"/>
+                <w:szCs w:val="28"/>
+                <w:cs/>
+                <w:lang w:bidi="ta-IN"/>
+              </w:rPr>
+              <w:t>மா</w:t>
+            </w:r>
+            <w:r>
+              <w:rPr>
+                <w:rFonts w:ascii="BRH Tamil Tab Extra" w:hAnsi="BRH Tamil Tab Extra" w:cs="Latha"/>
+                <w:b/>
+                <w:sz w:val="32"/>
+                <w:szCs w:val="28"/>
+                <w:lang w:bidi="ta-IN"/>
+              </w:rPr>
+              <w:t>…</w:t>
+            </w:r>
+            <w:r>
+              <w:rPr>
+                <w:rFonts w:ascii="Latha" w:hAnsi="Latha" w:cs="Latha"/>
+                <w:sz w:val="28"/>
+                <w:szCs w:val="28"/>
+                <w:cs/>
+                <w:lang w:bidi="ta-IN"/>
+              </w:rPr>
+              <w:t>ஸேப்</w:t>
+            </w:r>
+            <w:r>
+              <w:rPr>
+                <w:rFonts w:ascii="Latha" w:hAnsi="Latha" w:cs="Latha"/>
+                <w:b/>
+                <w:bCs/>
+                <w:position w:val="-12"/>
+                <w:sz w:val="28"/>
+                <w:szCs w:val="28"/>
+                <w:cs/>
+                <w:lang w:bidi="ta-IN"/>
+              </w:rPr>
+              <w:t>4</w:t>
+            </w:r>
+            <w:r>
+              <w:rPr>
+                <w:rFonts w:ascii="Latha" w:hAnsi="Latha" w:cs="Latha"/>
+                <w:sz w:val="28"/>
+                <w:szCs w:val="28"/>
+                <w:cs/>
+                <w:lang w:bidi="ta-IN"/>
+              </w:rPr>
+              <w:t>ய</w:t>
+            </w:r>
+            <w:r>
+              <w:rPr>
+                <w:rFonts w:ascii="BRH Tamil Tab Extra" w:hAnsi="BRH Tamil Tab Extra" w:cs="Latha"/>
+                <w:b/>
+                <w:sz w:val="36"/>
+                <w:szCs w:val="28"/>
+                <w:lang w:bidi="ta-IN"/>
+              </w:rPr>
+              <w:t>†</w:t>
+            </w:r>
+            <w:r>
+              <w:rPr>
+                <w:rFonts w:ascii="Latha" w:hAnsi="Latha" w:cs="Latha"/>
+                <w:b/>
+                <w:bCs/>
+                <w:sz w:val="32"/>
+                <w:szCs w:val="32"/>
+                <w:cs/>
+                <w:lang w:bidi="ta-IN"/>
+              </w:rPr>
+              <w:t>:</w:t>
+            </w:r>
+            <w:r>
+              <w:rPr>
+                <w:rFonts w:ascii="Latha" w:hAnsi="Latha" w:cs="Latha"/>
+                <w:sz w:val="28"/>
+                <w:szCs w:val="28"/>
+                <w:lang w:bidi="ta-IN"/>
+              </w:rPr>
+              <w:t xml:space="preserve"> | </w:t>
+            </w:r>
+            <w:r>
+              <w:rPr>
+                <w:rFonts w:ascii="Latha" w:hAnsi="Latha" w:cs="Latha"/>
+                <w:sz w:val="28"/>
+                <w:szCs w:val="28"/>
+                <w:cs/>
+                <w:lang w:bidi="ta-IN"/>
+              </w:rPr>
+              <w:t>அ</w:t>
+            </w:r>
+            <w:r>
+              <w:rPr>
+                <w:rFonts w:ascii="BRH Tamil Tab Extra" w:hAnsi="BRH Tamil Tab Extra" w:cs="Latha"/>
+                <w:b/>
+                <w:sz w:val="32"/>
+                <w:szCs w:val="28"/>
+                <w:lang w:bidi="ta-IN"/>
+              </w:rPr>
+              <w:t>…</w:t>
+            </w:r>
+            <w:r>
+              <w:rPr>
+                <w:rFonts w:ascii="Latha" w:hAnsi="Latha" w:cs="Latha"/>
+                <w:sz w:val="28"/>
+                <w:szCs w:val="28"/>
+                <w:cs/>
+                <w:lang w:bidi="ta-IN"/>
+              </w:rPr>
+              <w:t>ர்</w:t>
+            </w:r>
+            <w:r>
+              <w:rPr>
+                <w:rFonts w:ascii="Latha" w:hAnsi="Latha" w:cs="Latha" w:hint="cs"/>
+                <w:sz w:val="28"/>
+                <w:szCs w:val="28"/>
+                <w:highlight w:val="green"/>
+                <w:cs/>
+                <w:lang w:bidi="ta-IN"/>
+              </w:rPr>
+              <w:t>த்</w:t>
+            </w:r>
+            <w:r>
+              <w:rPr>
+                <w:rFonts w:ascii="Latha" w:hAnsi="Latha" w:cs="Latha" w:hint="cs"/>
+                <w:b/>
+                <w:bCs/>
+                <w:position w:val="-12"/>
+                <w:sz w:val="28"/>
+                <w:szCs w:val="28"/>
+                <w:highlight w:val="green"/>
+                <w:cs/>
+                <w:lang w:bidi="ta-IN"/>
+              </w:rPr>
+              <w:t>3</w:t>
+            </w:r>
+            <w:r>
+              <w:rPr>
+                <w:rFonts w:ascii="Latha" w:hAnsi="Latha" w:cs="Latha"/>
+                <w:sz w:val="28"/>
+                <w:szCs w:val="28"/>
+                <w:highlight w:val="green"/>
+                <w:cs/>
+                <w:lang w:bidi="ta-IN"/>
+              </w:rPr>
+              <w:t>த</w:t>
+            </w:r>
+            <w:r>
+              <w:rPr>
+                <w:rFonts w:ascii="BRH Tamil Tab Extra" w:hAnsi="BRH Tamil Tab Extra" w:cs="Latha"/>
+                <w:b/>
+                <w:sz w:val="32"/>
+                <w:szCs w:val="28"/>
+                <w:highlight w:val="green"/>
+                <w:lang w:bidi="ta-IN"/>
+              </w:rPr>
+              <w:t>…</w:t>
+            </w:r>
+            <w:r>
+              <w:rPr>
+                <w:rFonts w:ascii="Latha" w:hAnsi="Latha" w:cs="Latha"/>
+                <w:b/>
+                <w:bCs/>
+                <w:position w:val="-12"/>
+                <w:sz w:val="28"/>
+                <w:szCs w:val="28"/>
+                <w:highlight w:val="green"/>
+                <w:cs/>
+                <w:lang w:bidi="ta-IN"/>
+              </w:rPr>
+              <w:t>4</w:t>
+            </w:r>
+            <w:r>
+              <w:rPr>
+                <w:rFonts w:ascii="Latha" w:hAnsi="Latha" w:cs="Latha"/>
+                <w:sz w:val="28"/>
+                <w:szCs w:val="28"/>
+                <w:cs/>
+                <w:lang w:bidi="ta-IN"/>
+              </w:rPr>
+              <w:t>மா</w:t>
+            </w:r>
+            <w:r>
+              <w:rPr>
+                <w:rFonts w:ascii="BRH Tamil Tab Extra" w:hAnsi="BRH Tamil Tab Extra" w:cs="Latha"/>
+                <w:b/>
+                <w:sz w:val="32"/>
+                <w:szCs w:val="28"/>
+                <w:lang w:bidi="ta-IN"/>
+              </w:rPr>
+              <w:t>…</w:t>
+            </w:r>
+            <w:r>
+              <w:rPr>
+                <w:rFonts w:ascii="Latha" w:hAnsi="Latha" w:cs="Latha"/>
+                <w:sz w:val="28"/>
+                <w:szCs w:val="28"/>
+                <w:cs/>
+                <w:lang w:bidi="ta-IN"/>
+              </w:rPr>
+              <w:t>ஸேப்</w:t>
+            </w:r>
+            <w:r>
+              <w:rPr>
+                <w:rFonts w:ascii="Latha" w:hAnsi="Latha" w:cs="Latha"/>
+                <w:b/>
+                <w:bCs/>
+                <w:position w:val="-12"/>
+                <w:sz w:val="28"/>
+                <w:szCs w:val="28"/>
+                <w:cs/>
+                <w:lang w:bidi="ta-IN"/>
+              </w:rPr>
+              <w:t>4</w:t>
+            </w:r>
+            <w:r>
+              <w:rPr>
+                <w:rFonts w:ascii="Latha" w:hAnsi="Latha" w:cs="Latha"/>
+                <w:sz w:val="28"/>
+                <w:szCs w:val="28"/>
+                <w:cs/>
+                <w:lang w:bidi="ta-IN"/>
+              </w:rPr>
+              <w:t>ய</w:t>
+            </w:r>
+            <w:r>
+              <w:rPr>
+                <w:rFonts w:ascii="BRH Tamil Tab Extra" w:hAnsi="BRH Tamil Tab Extra" w:cs="Latha"/>
+                <w:b/>
+                <w:sz w:val="32"/>
+                <w:szCs w:val="28"/>
+                <w:lang w:bidi="ta-IN"/>
+              </w:rPr>
+              <w:t>…</w:t>
+            </w:r>
+            <w:r>
+              <w:rPr>
+                <w:rFonts w:ascii="Latha" w:hAnsi="Latha" w:cs="Latha"/>
+                <w:b/>
+                <w:bCs/>
+                <w:sz w:val="32"/>
+                <w:szCs w:val="32"/>
+                <w:cs/>
+                <w:lang w:bidi="ta-IN"/>
+              </w:rPr>
+              <w:t>:</w:t>
+            </w:r>
+            <w:r>
+              <w:rPr>
+                <w:rFonts w:ascii="Latha" w:hAnsi="Latha" w:cs="Latha"/>
+                <w:sz w:val="28"/>
+                <w:szCs w:val="28"/>
+                <w:cs/>
+                <w:lang w:bidi="ta-IN"/>
+              </w:rPr>
+              <w:t>ஸ்வாஹா</w:t>
+            </w:r>
+            <w:r>
+              <w:rPr>
+                <w:rFonts w:ascii="BRH Tamil Tab Extra" w:hAnsi="BRH Tamil Tab Extra" w:cs="Latha"/>
+                <w:b/>
+                <w:sz w:val="36"/>
+                <w:szCs w:val="28"/>
+                <w:lang w:bidi="ta-IN"/>
+              </w:rPr>
+              <w:t>‡</w:t>
+            </w:r>
+            <w:r>
+              <w:rPr>
+                <w:rFonts w:ascii="Latha" w:hAnsi="Latha" w:cs="Latha"/>
+                <w:sz w:val="28"/>
+                <w:szCs w:val="28"/>
+                <w:lang w:bidi="ta-IN"/>
+              </w:rPr>
+              <w:t xml:space="preserve"> | </w:t>
+            </w:r>
+          </w:p>
+          <w:p>
+            <w:pPr>
+              <w:widowControl w:val="0"/>
+              <w:autoSpaceDE w:val="0"/>
+              <w:autoSpaceDN w:val="0"/>
+              <w:adjustRightInd w:val="0"/>
+              <w:spacing w:before="0" w:line="240" w:lineRule="auto"/>
+              <w:rPr>
+                <w:rFonts w:ascii="Latha" w:hAnsi="Latha" w:cs="Latha"/>
+                <w:sz w:val="28"/>
+                <w:szCs w:val="28"/>
+                <w:cs/>
+                <w:lang w:bidi="ta-IN"/>
+              </w:rPr>
+            </w:pPr>
+            <w:r>
+              <w:rPr>
+                <w:rFonts w:ascii="Latha" w:hAnsi="Latha" w:cs="Latha"/>
+                <w:sz w:val="28"/>
+                <w:szCs w:val="28"/>
+                <w:cs/>
+                <w:lang w:bidi="ta-IN"/>
+              </w:rPr>
+              <w:t>அ</w:t>
+            </w:r>
+            <w:r>
+              <w:rPr>
+                <w:rFonts w:ascii="BRH Tamil Tab Extra" w:hAnsi="BRH Tamil Tab Extra" w:cs="Latha"/>
+                <w:b/>
+                <w:sz w:val="32"/>
+                <w:szCs w:val="28"/>
+                <w:lang w:bidi="ta-IN"/>
+              </w:rPr>
+              <w:t>…</w:t>
+            </w:r>
+            <w:r>
+              <w:rPr>
+                <w:rFonts w:ascii="Latha" w:hAnsi="Latha" w:cs="Latha"/>
+                <w:sz w:val="28"/>
+                <w:szCs w:val="28"/>
+                <w:cs/>
+                <w:lang w:bidi="ta-IN"/>
+              </w:rPr>
+              <w:t>ர்</w:t>
+            </w:r>
+            <w:r>
+              <w:rPr>
+                <w:rFonts w:ascii="Latha" w:hAnsi="Latha" w:cs="Latha" w:hint="cs"/>
+                <w:sz w:val="28"/>
+                <w:szCs w:val="28"/>
+                <w:highlight w:val="green"/>
+                <w:cs/>
+                <w:lang w:bidi="ta-IN"/>
+              </w:rPr>
+              <w:t>த்</w:t>
+            </w:r>
+            <w:r>
+              <w:rPr>
+                <w:rFonts w:ascii="Latha" w:hAnsi="Latha" w:cs="Latha" w:hint="cs"/>
+                <w:b/>
+                <w:bCs/>
+                <w:position w:val="-12"/>
+                <w:sz w:val="28"/>
+                <w:szCs w:val="28"/>
+                <w:highlight w:val="green"/>
+                <w:cs/>
+                <w:lang w:bidi="ta-IN"/>
+              </w:rPr>
+              <w:t>3</w:t>
+            </w:r>
+            <w:r>
+              <w:rPr>
+                <w:rFonts w:ascii="Latha" w:hAnsi="Latha" w:cs="Latha"/>
+                <w:sz w:val="28"/>
+                <w:szCs w:val="28"/>
+                <w:highlight w:val="green"/>
+                <w:cs/>
+                <w:lang w:bidi="ta-IN"/>
+              </w:rPr>
+              <w:t>த</w:t>
+            </w:r>
+            <w:r>
+              <w:rPr>
+                <w:rFonts w:ascii="BRH Tamil Tab Extra" w:hAnsi="BRH Tamil Tab Extra" w:cs="Latha"/>
+                <w:b/>
+                <w:sz w:val="32"/>
+                <w:szCs w:val="28"/>
+                <w:highlight w:val="green"/>
+                <w:lang w:bidi="ta-IN"/>
+              </w:rPr>
+              <w:t>…</w:t>
+            </w:r>
+            <w:r>
+              <w:rPr>
+                <w:rFonts w:ascii="Latha" w:hAnsi="Latha" w:cs="Latha"/>
+                <w:b/>
+                <w:bCs/>
+                <w:position w:val="-12"/>
+                <w:sz w:val="28"/>
+                <w:szCs w:val="28"/>
+                <w:highlight w:val="green"/>
+                <w:cs/>
+                <w:lang w:bidi="ta-IN"/>
+              </w:rPr>
+              <w:t>4</w:t>
+            </w:r>
+            <w:r>
+              <w:rPr>
+                <w:rFonts w:ascii="Latha" w:hAnsi="Latha" w:cs="Latha"/>
+                <w:sz w:val="28"/>
+                <w:szCs w:val="28"/>
+                <w:cs/>
+                <w:lang w:bidi="ta-IN"/>
+              </w:rPr>
+              <w:t>மா</w:t>
+            </w:r>
+            <w:r>
+              <w:rPr>
+                <w:rFonts w:ascii="BRH Tamil Tab Extra" w:hAnsi="BRH Tamil Tab Extra" w:cs="Latha"/>
+                <w:b/>
+                <w:sz w:val="32"/>
+                <w:szCs w:val="28"/>
+                <w:lang w:bidi="ta-IN"/>
+              </w:rPr>
+              <w:t>…</w:t>
+            </w:r>
+            <w:r>
+              <w:rPr>
+                <w:rFonts w:ascii="Latha" w:hAnsi="Latha" w:cs="Latha"/>
+                <w:sz w:val="28"/>
+                <w:szCs w:val="28"/>
+                <w:cs/>
+                <w:lang w:bidi="ta-IN"/>
+              </w:rPr>
+              <w:t>ஸேப்</w:t>
+            </w:r>
+            <w:r>
+              <w:rPr>
+                <w:rFonts w:ascii="Latha" w:hAnsi="Latha" w:cs="Latha"/>
+                <w:b/>
+                <w:bCs/>
+                <w:position w:val="-12"/>
+                <w:sz w:val="28"/>
+                <w:szCs w:val="28"/>
+                <w:cs/>
+                <w:lang w:bidi="ta-IN"/>
+              </w:rPr>
+              <w:t>4</w:t>
+            </w:r>
+            <w:r>
+              <w:rPr>
+                <w:rFonts w:ascii="Latha" w:hAnsi="Latha" w:cs="Latha"/>
+                <w:sz w:val="28"/>
+                <w:szCs w:val="28"/>
+                <w:cs/>
+                <w:lang w:bidi="ta-IN"/>
+              </w:rPr>
+              <w:t>ய</w:t>
+            </w:r>
+            <w:r>
+              <w:rPr>
+                <w:rFonts w:ascii="BRH Tamil Tab Extra" w:hAnsi="BRH Tamil Tab Extra" w:cs="Latha"/>
+                <w:b/>
+                <w:sz w:val="32"/>
+                <w:szCs w:val="28"/>
+                <w:lang w:bidi="ta-IN"/>
+              </w:rPr>
+              <w:t>…</w:t>
+            </w:r>
+            <w:r>
+              <w:rPr>
+                <w:rFonts w:ascii="Latha" w:hAnsi="Latha" w:cs="Latha"/>
+                <w:sz w:val="28"/>
+                <w:szCs w:val="28"/>
+                <w:lang w:bidi="ta-IN"/>
+              </w:rPr>
+              <w:t xml:space="preserve"> </w:t>
+            </w:r>
+            <w:r>
+              <w:rPr>
+                <w:rFonts w:ascii="Latha" w:hAnsi="Latha" w:cs="Latha"/>
+                <w:sz w:val="28"/>
+                <w:szCs w:val="28"/>
+                <w:cs/>
+                <w:lang w:bidi="ta-IN"/>
+              </w:rPr>
+              <w:t>இத்ய</w:t>
+            </w:r>
+            <w:r>
+              <w:rPr>
+                <w:rFonts w:ascii="BRH Tamil Tab Extra" w:hAnsi="BRH Tamil Tab Extra" w:cs="Latha"/>
+                <w:b/>
+                <w:sz w:val="36"/>
+                <w:szCs w:val="28"/>
+                <w:lang w:bidi="ta-IN"/>
+              </w:rPr>
+              <w:t>†</w:t>
+            </w:r>
+            <w:r>
+              <w:rPr>
+                <w:rFonts w:ascii="Latha" w:hAnsi="Latha" w:cs="Latha"/>
+                <w:sz w:val="28"/>
+                <w:szCs w:val="28"/>
+                <w:cs/>
+                <w:lang w:bidi="ta-IN"/>
+              </w:rPr>
+              <w:t>ர்</w:t>
+            </w:r>
+            <w:r>
+              <w:rPr>
+                <w:rFonts w:ascii="Latha" w:hAnsi="Latha" w:cs="Latha" w:hint="cs"/>
+                <w:sz w:val="28"/>
+                <w:szCs w:val="28"/>
+                <w:highlight w:val="green"/>
+                <w:cs/>
+                <w:lang w:bidi="ta-IN"/>
+              </w:rPr>
+              <w:t>த்</w:t>
+            </w:r>
+            <w:r>
+              <w:rPr>
+                <w:rFonts w:ascii="Latha" w:hAnsi="Latha" w:cs="Latha" w:hint="cs"/>
+                <w:b/>
+                <w:bCs/>
+                <w:position w:val="-12"/>
+                <w:sz w:val="28"/>
+                <w:szCs w:val="28"/>
+                <w:highlight w:val="green"/>
+                <w:cs/>
+                <w:lang w:bidi="ta-IN"/>
+              </w:rPr>
+              <w:t>3</w:t>
+            </w:r>
+            <w:r>
+              <w:rPr>
+                <w:rFonts w:ascii="Latha" w:hAnsi="Latha" w:cs="Latha"/>
+                <w:sz w:val="28"/>
+                <w:szCs w:val="28"/>
+                <w:highlight w:val="green"/>
+                <w:cs/>
+                <w:lang w:bidi="ta-IN"/>
+              </w:rPr>
+              <w:t>த</w:t>
+            </w:r>
+            <w:r>
+              <w:rPr>
+                <w:rFonts w:ascii="Latha" w:hAnsi="Latha" w:cs="Latha"/>
+                <w:b/>
+                <w:bCs/>
+                <w:position w:val="-12"/>
+                <w:sz w:val="28"/>
+                <w:szCs w:val="28"/>
+                <w:highlight w:val="green"/>
+                <w:cs/>
+                <w:lang w:bidi="ta-IN"/>
+              </w:rPr>
+              <w:t>4</w:t>
+            </w:r>
+            <w:r>
+              <w:rPr>
+                <w:rFonts w:ascii="Latha" w:hAnsi="Latha" w:cs="Latha"/>
+                <w:sz w:val="28"/>
+                <w:szCs w:val="28"/>
+                <w:lang w:bidi="ta-IN"/>
+              </w:rPr>
+              <w:t xml:space="preserve"> - </w:t>
+            </w:r>
+            <w:r>
+              <w:rPr>
+                <w:rFonts w:ascii="Latha" w:hAnsi="Latha" w:cs="Latha"/>
+                <w:sz w:val="28"/>
+                <w:szCs w:val="28"/>
+                <w:cs/>
+                <w:lang w:bidi="ta-IN"/>
+              </w:rPr>
+              <w:t>மா</w:t>
+            </w:r>
+            <w:r>
+              <w:rPr>
+                <w:rFonts w:ascii="BRH Tamil Tab Extra" w:hAnsi="BRH Tamil Tab Extra" w:cs="Latha"/>
+                <w:b/>
+                <w:sz w:val="32"/>
+                <w:szCs w:val="28"/>
+                <w:lang w:bidi="ta-IN"/>
+              </w:rPr>
+              <w:t>…</w:t>
+            </w:r>
+            <w:r>
+              <w:rPr>
+                <w:rFonts w:ascii="Latha" w:hAnsi="Latha" w:cs="Latha"/>
+                <w:sz w:val="28"/>
+                <w:szCs w:val="28"/>
+                <w:cs/>
+                <w:lang w:bidi="ta-IN"/>
+              </w:rPr>
+              <w:t>ஸேப்</w:t>
+            </w:r>
+            <w:r>
+              <w:rPr>
+                <w:rFonts w:ascii="Latha" w:hAnsi="Latha" w:cs="Latha"/>
+                <w:b/>
+                <w:bCs/>
+                <w:position w:val="-12"/>
+                <w:sz w:val="28"/>
+                <w:szCs w:val="28"/>
+                <w:cs/>
+                <w:lang w:bidi="ta-IN"/>
+              </w:rPr>
+              <w:t>4</w:t>
+            </w:r>
+            <w:r>
+              <w:rPr>
+                <w:rFonts w:ascii="Latha" w:hAnsi="Latha" w:cs="Latha"/>
+                <w:sz w:val="28"/>
+                <w:szCs w:val="28"/>
+                <w:cs/>
+                <w:lang w:bidi="ta-IN"/>
+              </w:rPr>
+              <w:t>ய</w:t>
+            </w:r>
+            <w:r>
+              <w:rPr>
+                <w:rFonts w:ascii="BRH Tamil Tab Extra" w:hAnsi="BRH Tamil Tab Extra" w:cs="Latha"/>
+                <w:b/>
+                <w:sz w:val="36"/>
+                <w:szCs w:val="28"/>
+                <w:lang w:bidi="ta-IN"/>
+              </w:rPr>
+              <w:t>†</w:t>
+            </w:r>
+            <w:r>
+              <w:rPr>
+                <w:rFonts w:ascii="Latha" w:hAnsi="Latha" w:cs="Latha"/>
+                <w:b/>
+                <w:bCs/>
+                <w:sz w:val="32"/>
+                <w:szCs w:val="32"/>
+                <w:cs/>
+                <w:lang w:bidi="ta-IN"/>
+              </w:rPr>
+              <w:t>:</w:t>
+            </w:r>
+            <w:r>
+              <w:rPr>
+                <w:rFonts w:ascii="Latha" w:hAnsi="Latha" w:cs="Latha"/>
+                <w:sz w:val="28"/>
+                <w:szCs w:val="28"/>
+                <w:lang w:bidi="ta-IN"/>
+              </w:rPr>
+              <w:t xml:space="preserve"> |</w:t>
+            </w:r>
+          </w:p>
+        </w:tc>
+      </w:tr>
+      <w:tr>
+        <w:trPr>
+          <w:trHeight w:val="964"/>
+        </w:trPr>
+        <w:tc>
+          <w:tcPr>
+            <w:tcW w:w="3878" w:type="dxa"/>
+          </w:tcPr>
+          <w:p>
+            <w:pPr>
+              <w:widowControl w:val="0"/>
+              <w:tabs>
+                <w:tab w:val="left" w:pos="993"/>
+              </w:tabs>
+              <w:autoSpaceDE w:val="0"/>
+              <w:autoSpaceDN w:val="0"/>
+              <w:adjustRightInd w:val="0"/>
+              <w:spacing w:before="0" w:line="252" w:lineRule="auto"/>
+              <w:ind w:right="297"/>
+              <w:rPr>
+                <w:rFonts w:cs="Arial"/>
+                <w:b/>
+                <w:sz w:val="28"/>
+                <w:szCs w:val="28"/>
+              </w:rPr>
+            </w:pPr>
+            <w:r>
+              <w:rPr>
+                <w:rFonts w:cs="Arial"/>
+                <w:b/>
+                <w:sz w:val="28"/>
+                <w:szCs w:val="28"/>
+              </w:rPr>
+              <w:t>T.S.7.1.</w:t>
+            </w:r>
+            <w:r>
+              <w:rPr>
+                <w:rFonts w:cs="Arial"/>
+                <w:b/>
+                <w:sz w:val="28"/>
+                <w:szCs w:val="28"/>
+              </w:rPr>
+              <w:t>1</w:t>
+            </w:r>
+            <w:r>
+              <w:rPr>
+                <w:rFonts w:cs="Arial"/>
+                <w:b/>
+                <w:sz w:val="28"/>
+                <w:szCs w:val="28"/>
+              </w:rPr>
+              <w:t>8</w:t>
+            </w:r>
+            <w:r>
+              <w:rPr>
+                <w:rFonts w:cs="Arial"/>
+                <w:b/>
+                <w:sz w:val="28"/>
+                <w:szCs w:val="28"/>
+              </w:rPr>
+              <w:t>.</w:t>
+            </w:r>
+            <w:r>
+              <w:rPr>
+                <w:rFonts w:cs="Arial"/>
+                <w:b/>
+                <w:sz w:val="28"/>
+                <w:szCs w:val="28"/>
+              </w:rPr>
+              <w:t>1</w:t>
+            </w:r>
+            <w:r>
+              <w:rPr>
+                <w:rFonts w:cs="Arial"/>
+                <w:b/>
+                <w:sz w:val="28"/>
+                <w:szCs w:val="28"/>
+              </w:rPr>
+              <w:t xml:space="preserve"> – Kramam</w:t>
+            </w:r>
+          </w:p>
+          <w:p>
+            <w:pPr>
+              <w:widowControl w:val="0"/>
+              <w:tabs>
+                <w:tab w:val="left" w:pos="993"/>
+              </w:tabs>
+              <w:autoSpaceDE w:val="0"/>
+              <w:autoSpaceDN w:val="0"/>
+              <w:adjustRightInd w:val="0"/>
+              <w:spacing w:before="0" w:line="252" w:lineRule="auto"/>
+              <w:ind w:right="297"/>
+              <w:rPr>
+                <w:rFonts w:cs="Arial"/>
+                <w:b/>
+                <w:sz w:val="28"/>
+                <w:szCs w:val="28"/>
+              </w:rPr>
+            </w:pPr>
+            <w:r>
+              <w:rPr>
+                <w:rFonts w:cs="Arial"/>
+                <w:b/>
+                <w:sz w:val="28"/>
+                <w:szCs w:val="28"/>
+              </w:rPr>
+              <w:t xml:space="preserve">Krama Vaakyam No.– </w:t>
+            </w:r>
+            <w:r>
+              <w:rPr>
+                <w:rFonts w:cs="Arial"/>
+                <w:b/>
+                <w:sz w:val="28"/>
+                <w:szCs w:val="28"/>
+              </w:rPr>
+              <w:t>52</w:t>
+            </w:r>
+          </w:p>
+          <w:p>
+            <w:pPr>
+              <w:widowControl w:val="0"/>
+              <w:tabs>
+                <w:tab w:val="left" w:pos="993"/>
+              </w:tabs>
+              <w:autoSpaceDE w:val="0"/>
+              <w:autoSpaceDN w:val="0"/>
+              <w:adjustRightInd w:val="0"/>
+              <w:spacing w:before="0" w:line="252" w:lineRule="auto"/>
+              <w:ind w:right="297"/>
+              <w:rPr>
+                <w:rFonts w:cs="Arial"/>
+                <w:b/>
+                <w:sz w:val="28"/>
+                <w:szCs w:val="28"/>
+              </w:rPr>
+            </w:pPr>
+            <w:r>
+              <w:rPr>
+                <w:rFonts w:cs="Arial"/>
+                <w:b/>
+                <w:sz w:val="28"/>
+                <w:szCs w:val="28"/>
+              </w:rPr>
+              <w:t xml:space="preserve">Panchaati No. - </w:t>
+            </w:r>
+            <w:r>
+              <w:rPr>
+                <w:rFonts w:cs="Arial"/>
+                <w:b/>
+                <w:sz w:val="28"/>
+                <w:szCs w:val="28"/>
+              </w:rPr>
+              <w:t>4</w:t>
+            </w:r>
+            <w:r>
+              <w:rPr>
+                <w:rFonts w:cs="Arial"/>
+                <w:b/>
+                <w:sz w:val="28"/>
+                <w:szCs w:val="28"/>
+              </w:rPr>
+              <w:t>7</w:t>
+            </w:r>
+          </w:p>
+        </w:tc>
+        <w:tc>
+          <w:tcPr>
+            <w:tcW w:w="4740" w:type="dxa"/>
+          </w:tcPr>
+          <w:p>
+            <w:pPr>
+              <w:autoSpaceDE w:val="0"/>
+              <w:autoSpaceDN w:val="0"/>
+              <w:adjustRightInd w:val="0"/>
+              <w:spacing w:line="252" w:lineRule="auto"/>
+              <w:rPr>
+                <w:rFonts w:ascii="Latha" w:hAnsi="Latha" w:cs="Latha"/>
+                <w:sz w:val="28"/>
+                <w:szCs w:val="28"/>
+                <w:cs/>
+                <w:lang w:bidi="ta-IN"/>
+              </w:rPr>
+            </w:pPr>
+            <w:r>
+              <w:rPr>
+                <w:rFonts w:ascii="Latha" w:hAnsi="Latha" w:cs="Latha"/>
+                <w:sz w:val="28"/>
+                <w:szCs w:val="28"/>
+                <w:highlight w:val="yellow"/>
+                <w:cs/>
+                <w:lang w:bidi="ta-IN"/>
+              </w:rPr>
+              <w:t>ய</w:t>
+            </w:r>
+            <w:r>
+              <w:rPr>
+                <w:rFonts w:ascii="BRH Tamil Tab Extra" w:hAnsi="BRH Tamil Tab Extra" w:cs="Latha"/>
+                <w:b/>
+                <w:sz w:val="32"/>
+                <w:szCs w:val="28"/>
+                <w:lang w:bidi="ta-IN"/>
+              </w:rPr>
+              <w:t>…</w:t>
+            </w:r>
+            <w:r>
+              <w:rPr>
+                <w:rFonts w:ascii="Latha" w:hAnsi="Latha" w:cs="Latha"/>
+                <w:sz w:val="28"/>
+                <w:szCs w:val="28"/>
+                <w:cs/>
+                <w:lang w:bidi="ta-IN"/>
+              </w:rPr>
+              <w:t>ன</w:t>
+            </w:r>
+            <w:r>
+              <w:rPr>
+                <w:rFonts w:ascii="BRH Tamil Tab Extra" w:hAnsi="BRH Tamil Tab Extra" w:cs="Latha"/>
+                <w:b/>
+                <w:sz w:val="32"/>
+                <w:szCs w:val="28"/>
+                <w:lang w:bidi="ta-IN"/>
+              </w:rPr>
+              <w:t>…</w:t>
+            </w:r>
+            <w:r>
+              <w:rPr>
+                <w:rFonts w:ascii="Latha" w:hAnsi="Latha" w:cs="Latha"/>
+                <w:sz w:val="28"/>
+                <w:szCs w:val="28"/>
+                <w:cs/>
+                <w:lang w:bidi="ta-IN"/>
+              </w:rPr>
+              <w:t>ஜ்மி</w:t>
+            </w:r>
+            <w:r>
+              <w:rPr>
+                <w:rFonts w:ascii="BRH Tamil Tab Extra" w:hAnsi="BRH Tamil Tab Extra" w:cs="Latha"/>
+                <w:b/>
+                <w:sz w:val="32"/>
+                <w:szCs w:val="28"/>
+                <w:lang w:bidi="ta-IN"/>
+              </w:rPr>
+              <w:t>…</w:t>
+            </w:r>
+            <w:r>
+              <w:rPr>
+                <w:rFonts w:ascii="Latha" w:hAnsi="Latha" w:cs="Latha"/>
+                <w:sz w:val="28"/>
+                <w:szCs w:val="28"/>
+                <w:lang w:bidi="ta-IN"/>
+              </w:rPr>
+              <w:t xml:space="preserve"> </w:t>
+            </w:r>
+            <w:r>
+              <w:rPr>
+                <w:rFonts w:ascii="Latha" w:hAnsi="Latha" w:cs="Latha"/>
+                <w:sz w:val="28"/>
+                <w:szCs w:val="28"/>
+                <w:cs/>
+                <w:lang w:bidi="ta-IN"/>
+              </w:rPr>
+              <w:t>ஶ</w:t>
+            </w:r>
+            <w:r>
+              <w:rPr>
+                <w:rFonts w:ascii="BRH Tamil Tab Extra" w:hAnsi="BRH Tamil Tab Extra" w:cs="Latha"/>
+                <w:b/>
+                <w:sz w:val="32"/>
+                <w:szCs w:val="28"/>
+                <w:lang w:bidi="ta-IN"/>
+              </w:rPr>
+              <w:t>…</w:t>
+            </w:r>
+            <w:r>
+              <w:rPr>
+                <w:rFonts w:ascii="Latha" w:hAnsi="Latha" w:cs="Latha"/>
+                <w:sz w:val="28"/>
+                <w:szCs w:val="28"/>
+                <w:cs/>
+                <w:lang w:bidi="ta-IN"/>
+              </w:rPr>
+              <w:t>ரதா</w:t>
+            </w:r>
+            <w:r>
+              <w:rPr>
+                <w:rFonts w:ascii="BRH Tamil Tab Extra" w:hAnsi="BRH Tamil Tab Extra" w:cs="Latha"/>
+                <w:b/>
+                <w:sz w:val="36"/>
+                <w:szCs w:val="28"/>
+                <w:lang w:bidi="ta-IN"/>
+              </w:rPr>
+              <w:t>‡</w:t>
+            </w:r>
+            <w:r>
+              <w:rPr>
+                <w:rFonts w:ascii="Latha" w:hAnsi="Latha" w:cs="Latha"/>
+                <w:b/>
+                <w:bCs/>
+                <w:position w:val="-12"/>
+                <w:sz w:val="28"/>
+                <w:szCs w:val="28"/>
+                <w:cs/>
+                <w:lang w:bidi="ta-IN"/>
+              </w:rPr>
+              <w:t>3</w:t>
+            </w:r>
+            <w:r>
+              <w:rPr>
+                <w:rFonts w:ascii="Latha" w:hAnsi="Latha" w:cs="Latha"/>
+                <w:sz w:val="28"/>
+                <w:szCs w:val="28"/>
+                <w:lang w:bidi="ta-IN"/>
+              </w:rPr>
+              <w:t xml:space="preserve"> | </w:t>
+            </w:r>
+            <w:r>
+              <w:rPr>
+                <w:rFonts w:ascii="Latha" w:hAnsi="Latha" w:cs="Latha"/>
+                <w:b/>
+                <w:bCs/>
+                <w:sz w:val="32"/>
+                <w:szCs w:val="32"/>
+                <w:cs/>
+                <w:lang w:bidi="ta-IN"/>
+              </w:rPr>
+              <w:t>47</w:t>
+            </w:r>
+          </w:p>
+        </w:tc>
+        <w:tc>
+          <w:tcPr>
+            <w:tcW w:w="5222" w:type="dxa"/>
+          </w:tcPr>
+          <w:p>
+            <w:pPr>
+              <w:autoSpaceDE w:val="0"/>
+              <w:autoSpaceDN w:val="0"/>
+              <w:adjustRightInd w:val="0"/>
+              <w:spacing w:line="252" w:lineRule="auto"/>
+              <w:rPr>
+                <w:rFonts w:ascii="Latha" w:hAnsi="Latha" w:cs="Latha"/>
+                <w:sz w:val="28"/>
+                <w:szCs w:val="28"/>
+                <w:cs/>
+                <w:lang w:bidi="ta-IN"/>
+              </w:rPr>
+            </w:pPr>
+            <w:r>
+              <w:rPr>
+                <w:rFonts w:ascii="Latha" w:hAnsi="Latha" w:cs="Latha"/>
+                <w:sz w:val="28"/>
+                <w:szCs w:val="28"/>
+                <w:highlight w:val="green"/>
+                <w:cs/>
+                <w:lang w:bidi="ta-IN"/>
+              </w:rPr>
+              <w:t>யு</w:t>
+            </w:r>
+            <w:r>
+              <w:rPr>
+                <w:rFonts w:ascii="BRH Tamil Tab Extra" w:hAnsi="BRH Tamil Tab Extra" w:cs="Latha"/>
+                <w:b/>
+                <w:sz w:val="32"/>
+                <w:szCs w:val="28"/>
+                <w:lang w:bidi="ta-IN"/>
+              </w:rPr>
+              <w:t>…</w:t>
+            </w:r>
+            <w:r>
+              <w:rPr>
+                <w:rFonts w:ascii="Latha" w:hAnsi="Latha" w:cs="Latha"/>
+                <w:sz w:val="28"/>
+                <w:szCs w:val="28"/>
+                <w:cs/>
+                <w:lang w:bidi="ta-IN"/>
+              </w:rPr>
+              <w:t>ன</w:t>
+            </w:r>
+            <w:r>
+              <w:rPr>
+                <w:rFonts w:ascii="BRH Tamil Tab Extra" w:hAnsi="BRH Tamil Tab Extra" w:cs="Latha"/>
+                <w:b/>
+                <w:sz w:val="32"/>
+                <w:szCs w:val="28"/>
+                <w:lang w:bidi="ta-IN"/>
+              </w:rPr>
+              <w:t>…</w:t>
+            </w:r>
+            <w:r>
+              <w:rPr>
+                <w:rFonts w:ascii="Latha" w:hAnsi="Latha" w:cs="Latha"/>
+                <w:sz w:val="28"/>
+                <w:szCs w:val="28"/>
+                <w:cs/>
+                <w:lang w:bidi="ta-IN"/>
+              </w:rPr>
+              <w:t>ஜ்மி</w:t>
+            </w:r>
+            <w:r>
+              <w:rPr>
+                <w:rFonts w:ascii="BRH Tamil Tab Extra" w:hAnsi="BRH Tamil Tab Extra" w:cs="Latha"/>
+                <w:b/>
+                <w:sz w:val="32"/>
+                <w:szCs w:val="28"/>
+                <w:lang w:bidi="ta-IN"/>
+              </w:rPr>
+              <w:t>…</w:t>
+            </w:r>
+            <w:r>
+              <w:rPr>
+                <w:rFonts w:ascii="Latha" w:hAnsi="Latha" w:cs="Latha"/>
+                <w:sz w:val="28"/>
+                <w:szCs w:val="28"/>
+                <w:lang w:bidi="ta-IN"/>
+              </w:rPr>
+              <w:t xml:space="preserve"> </w:t>
+            </w:r>
+            <w:r>
+              <w:rPr>
+                <w:rFonts w:ascii="Latha" w:hAnsi="Latha" w:cs="Latha"/>
+                <w:sz w:val="28"/>
+                <w:szCs w:val="28"/>
+                <w:cs/>
+                <w:lang w:bidi="ta-IN"/>
+              </w:rPr>
+              <w:t>ஶ</w:t>
+            </w:r>
+            <w:r>
+              <w:rPr>
+                <w:rFonts w:ascii="BRH Tamil Tab Extra" w:hAnsi="BRH Tamil Tab Extra" w:cs="Latha"/>
+                <w:b/>
+                <w:sz w:val="32"/>
+                <w:szCs w:val="28"/>
+                <w:lang w:bidi="ta-IN"/>
+              </w:rPr>
+              <w:t>…</w:t>
+            </w:r>
+            <w:r>
+              <w:rPr>
+                <w:rFonts w:ascii="Latha" w:hAnsi="Latha" w:cs="Latha"/>
+                <w:sz w:val="28"/>
+                <w:szCs w:val="28"/>
+                <w:cs/>
+                <w:lang w:bidi="ta-IN"/>
+              </w:rPr>
+              <w:t>ரதா</w:t>
+            </w:r>
+            <w:r>
+              <w:rPr>
+                <w:rFonts w:ascii="BRH Tamil Tab Extra" w:hAnsi="BRH Tamil Tab Extra" w:cs="Latha"/>
+                <w:b/>
+                <w:sz w:val="36"/>
+                <w:szCs w:val="28"/>
+                <w:lang w:bidi="ta-IN"/>
+              </w:rPr>
+              <w:t>‡</w:t>
+            </w:r>
+            <w:r>
+              <w:rPr>
+                <w:rFonts w:ascii="Latha" w:hAnsi="Latha" w:cs="Latha"/>
+                <w:b/>
+                <w:bCs/>
+                <w:position w:val="-12"/>
+                <w:sz w:val="28"/>
+                <w:szCs w:val="28"/>
+                <w:cs/>
+                <w:lang w:bidi="ta-IN"/>
+              </w:rPr>
+              <w:t>3</w:t>
+            </w:r>
+            <w:r>
+              <w:rPr>
+                <w:rFonts w:ascii="Latha" w:hAnsi="Latha" w:cs="Latha"/>
+                <w:sz w:val="28"/>
+                <w:szCs w:val="28"/>
+                <w:lang w:bidi="ta-IN"/>
+              </w:rPr>
+              <w:t xml:space="preserve"> | </w:t>
+            </w:r>
+            <w:r>
+              <w:rPr>
+                <w:rFonts w:ascii="Latha" w:hAnsi="Latha" w:cs="Latha"/>
+                <w:b/>
+                <w:bCs/>
+                <w:sz w:val="32"/>
+                <w:szCs w:val="32"/>
+                <w:cs/>
+                <w:lang w:bidi="ta-IN"/>
+              </w:rPr>
+              <w:t>47</w:t>
+            </w:r>
+          </w:p>
+        </w:tc>
+      </w:tr>
+    </w:tbl>
+    <w:p>
+      <w:pPr>
+        <w:jc w:val="center"/>
+        <w:rPr>
+          <w:b/>
+          <w:bCs/>
+          <w:sz w:val="32"/>
+          <w:szCs w:val="32"/>
+          <w:u w:val="single"/>
+        </w:rPr>
+      </w:pPr>
+    </w:p>
+    <w:p>
+      <w:pPr>
+        <w:jc w:val="center"/>
+        <w:rPr>
+          <w:b/>
+          <w:bCs/>
+          <w:sz w:val="32"/>
+          <w:szCs w:val="32"/>
+          <w:u w:val="single"/>
+        </w:rPr>
+      </w:pPr>
+      <w:r>
+        <w:rPr>
+          <w:b/>
+          <w:bCs/>
+          <w:sz w:val="32"/>
+          <w:szCs w:val="32"/>
+          <w:u w:val="single"/>
+        </w:rPr>
+        <w:lastRenderedPageBreak/>
         <w:t xml:space="preserve">TS </w:t>
       </w:r>
       <w:r>
@@ -128,23 +3356,7 @@
           <w:b/>
           <w:bCs/>
         </w:rPr>
-        <w:t>(</w:t>
-      </w:r>
-      <w:proofErr w:type="gramStart"/>
-      <w:r>
-        <w:rPr>
-          <w:b/>
-          <w:bCs/>
-        </w:rPr>
-        <w:t>ignore</w:t>
-      </w:r>
-      <w:proofErr w:type="gramEnd"/>
-      <w:r>
-        <w:rPr>
-          <w:b/>
-          <w:bCs/>
-        </w:rPr>
-        <w:t xml:space="preserve"> those which are already incorporated in your book’s version and date)</w:t>
+        <w:t>(ignore those which are already incorporated in your book’s version and date)</w:t>
       </w:r>
     </w:p>
     <w:tbl>
@@ -7587,7 +10799,23 @@
                 <w:b/>
                 <w:bCs/>
               </w:rPr>
-              <w:t>is not trikramam)</w:t>
+              <w:t xml:space="preserve">is not </w:t>
+            </w:r>
+            <w:proofErr w:type="spellStart"/>
+            <w:r>
+              <w:rPr>
+                <w:b/>
+                <w:bCs/>
+              </w:rPr>
+              <w:t>trikramam</w:t>
+            </w:r>
+            <w:proofErr w:type="spellEnd"/>
+            <w:r>
+              <w:rPr>
+                <w:b/>
+                <w:bCs/>
+              </w:rPr>
+              <w:t>)</w:t>
             </w:r>
           </w:p>
         </w:tc>
@@ -8851,7 +12079,23 @@
                 <w:b/>
                 <w:bCs/>
               </w:rPr>
-              <w:t>is not trikramam)</w:t>
+              <w:t xml:space="preserve">is not </w:t>
+            </w:r>
+            <w:proofErr w:type="spellStart"/>
+            <w:r>
+              <w:rPr>
+                <w:b/>
+                <w:bCs/>
+              </w:rPr>
+              <w:t>trikramam</w:t>
+            </w:r>
+            <w:proofErr w:type="spellEnd"/>
+            <w:r>
+              <w:rPr>
+                <w:b/>
+                <w:bCs/>
+              </w:rPr>
+              <w:t>)</w:t>
             </w:r>
           </w:p>
         </w:tc>
@@ -9470,7 +12714,23 @@
                 <w:b/>
                 <w:bCs/>
               </w:rPr>
-              <w:t>is not trikramam)</w:t>
+              <w:t xml:space="preserve">is not </w:t>
+            </w:r>
+            <w:proofErr w:type="spellStart"/>
+            <w:r>
+              <w:rPr>
+                <w:b/>
+                <w:bCs/>
+              </w:rPr>
+              <w:t>trikramam</w:t>
+            </w:r>
+            <w:proofErr w:type="spellEnd"/>
+            <w:r>
+              <w:rPr>
+                <w:b/>
+                <w:bCs/>
+              </w:rPr>
+              <w:t>)</w:t>
             </w:r>
           </w:p>
         </w:tc>
@@ -14770,7 +18030,31 @@
                 <w:highlight w:val="yellow"/>
                 <w:lang w:bidi="ta-IN"/>
               </w:rPr>
-              <w:t xml:space="preserve">missing kramam </w:t>
+              <w:t xml:space="preserve">missing </w:t>
+            </w:r>
+            <w:proofErr w:type="spellStart"/>
+            <w:r>
+              <w:rPr>
+                <w:rFonts w:ascii="Latha" w:hAnsi="Latha" w:cs="Latha"/>
+                <w:color w:val="FF0000"/>
+                <w:sz w:val="28"/>
+                <w:szCs w:val="28"/>
+                <w:highlight w:val="yellow"/>
+                <w:lang w:bidi="ta-IN"/>
+              </w:rPr>
+              <w:t>kramam</w:t>
+            </w:r>
+            <w:proofErr w:type="spellEnd"/>
+            <w:r>
+              <w:rPr>
+                <w:rFonts w:ascii="Latha" w:hAnsi="Latha" w:cs="Latha"/>
+                <w:color w:val="FF0000"/>
+                <w:sz w:val="28"/>
+                <w:szCs w:val="28"/>
+                <w:highlight w:val="yellow"/>
+                <w:lang w:bidi="ta-IN"/>
+              </w:rPr>
+              <w:t xml:space="preserve"> </w:t>
             </w:r>
             <w:r>
               <w:rPr>
@@ -15184,12 +18468,21 @@
               </w:rPr>
               <w:t xml:space="preserve"> </w:t>
             </w:r>
+            <w:proofErr w:type="spellStart"/>
             <w:r>
               <w:rPr>
                 <w:b/>
                 <w:bCs/>
               </w:rPr>
-              <w:t>padam inserted)</w:t>
+              <w:t>padam</w:t>
+            </w:r>
+            <w:proofErr w:type="spellEnd"/>
+            <w:r>
+              <w:rPr>
+                <w:b/>
+                <w:bCs/>
+              </w:rPr>
+              <w:t xml:space="preserve"> inserted)</w:t>
             </w:r>
           </w:p>
         </w:tc>
@@ -17014,16 +20307,7 @@
           <w:bCs/>
           <w:sz w:val="32"/>
         </w:rPr>
-        <w:t xml:space="preserve">replaced </w:t>
-      </w:r>
-      <w:proofErr w:type="gramStart"/>
-      <w:r>
-        <w:rPr>
-          <w:b/>
-          <w:bCs/>
-          <w:sz w:val="32"/>
-        </w:rPr>
-        <w:t>with</w:t>
+        <w:t>replaced with</w:t>
       </w:r>
       <w:r>
         <w:rPr>
@@ -17045,7 +20329,6 @@
         </w:rPr>
         <w:t>"</w:t>
       </w:r>
-      <w:proofErr w:type="gramEnd"/>
       <w:r>
         <w:rPr>
           <w:rFonts w:ascii="Latha" w:hAnsi="Latha" w:cs="Latha"/>
@@ -17432,7 +20715,6 @@
         <w:tc>
           <w:tcPr>
             <w:tcW w:w="3828" w:type="dxa"/>
-            <w:shd w:val="clear" w:color="auto" w:fill="auto"/>
           </w:tcPr>
           <w:p>
             <w:pPr>
@@ -17519,7 +20801,6 @@
         <w:tc>
           <w:tcPr>
             <w:tcW w:w="4536" w:type="dxa"/>
-            <w:shd w:val="clear" w:color="auto" w:fill="auto"/>
           </w:tcPr>
           <w:p>
             <w:pPr>
@@ -17801,7 +21082,6 @@
         <w:tc>
           <w:tcPr>
             <w:tcW w:w="5103" w:type="dxa"/>
-            <w:shd w:val="clear" w:color="auto" w:fill="auto"/>
           </w:tcPr>
           <w:p>
             <w:pPr>
@@ -18085,7 +21365,6 @@
         <w:tc>
           <w:tcPr>
             <w:tcW w:w="3828" w:type="dxa"/>
-            <w:shd w:val="clear" w:color="auto" w:fill="auto"/>
           </w:tcPr>
           <w:p>
             <w:pPr>
@@ -18190,7 +21469,6 @@
         <w:tc>
           <w:tcPr>
             <w:tcW w:w="4536" w:type="dxa"/>
-            <w:shd w:val="clear" w:color="auto" w:fill="auto"/>
           </w:tcPr>
           <w:p>
             <w:pPr>
@@ -18402,7 +21680,6 @@
         <w:tc>
           <w:tcPr>
             <w:tcW w:w="5103" w:type="dxa"/>
-            <w:shd w:val="clear" w:color="auto" w:fill="auto"/>
           </w:tcPr>
           <w:p>
             <w:pPr>
@@ -18654,6 +21931,7 @@
               </w:rPr>
               <w:t xml:space="preserve"> | </w:t>
             </w:r>
+            <w:proofErr w:type="spellStart"/>
             <w:r>
               <w:rPr>
                 <w:rFonts w:cs="Arial"/>
@@ -18661,7 +21939,17 @@
                 <w:sz w:val="28"/>
                 <w:szCs w:val="28"/>
               </w:rPr>
-              <w:t>Trikrama correction done.</w:t>
+              <w:t>Trikrama</w:t>
+            </w:r>
+            <w:proofErr w:type="spellEnd"/>
+            <w:r>
+              <w:rPr>
+                <w:rFonts w:cs="Arial"/>
+                <w:color w:val="000000"/>
+                <w:sz w:val="28"/>
+                <w:szCs w:val="28"/>
+              </w:rPr>
+              <w:t xml:space="preserve"> correction done.</w:t>
             </w:r>
             <w:r>
               <w:rPr>
@@ -18715,7 +22003,27 @@
                 <w:sz w:val="28"/>
                 <w:szCs w:val="28"/>
               </w:rPr>
-              <w:t>’ trikramam)</w:t>
+              <w:t xml:space="preserve">’ </w:t>
+            </w:r>
+            <w:proofErr w:type="spellStart"/>
+            <w:r>
+              <w:rPr>
+                <w:rFonts w:cs="Arial"/>
+                <w:color w:val="000000"/>
+                <w:sz w:val="28"/>
+                <w:szCs w:val="28"/>
+              </w:rPr>
+              <w:t>trikramam</w:t>
+            </w:r>
+            <w:proofErr w:type="spellEnd"/>
+            <w:r>
+              <w:rPr>
+                <w:rFonts w:cs="Arial"/>
+                <w:color w:val="000000"/>
+                <w:sz w:val="28"/>
+                <w:szCs w:val="28"/>
+              </w:rPr>
+              <w:t>)</w:t>
             </w:r>
           </w:p>
         </w:tc>
@@ -18730,7 +22038,6 @@
               <w:bottom w:val="single" w:sz="4" w:space="0" w:color="000000"/>
               <w:right w:val="single" w:sz="4" w:space="0" w:color="000000"/>
             </w:tcBorders>
-            <w:shd w:val="clear" w:color="auto" w:fill="auto"/>
           </w:tcPr>
           <w:p>
             <w:pPr>
@@ -18802,7 +22109,6 @@
               <w:bottom w:val="single" w:sz="4" w:space="0" w:color="000000"/>
               <w:right w:val="single" w:sz="4" w:space="0" w:color="000000"/>
             </w:tcBorders>
-            <w:shd w:val="clear" w:color="auto" w:fill="auto"/>
           </w:tcPr>
           <w:p>
             <w:pPr>
@@ -18991,7 +22297,6 @@
               <w:bottom w:val="single" w:sz="4" w:space="0" w:color="000000"/>
               <w:right w:val="single" w:sz="4" w:space="0" w:color="000000"/>
             </w:tcBorders>
-            <w:shd w:val="clear" w:color="auto" w:fill="auto"/>
           </w:tcPr>
           <w:p>
             <w:pPr>
@@ -19199,6 +22504,7 @@
               </w:rPr>
               <w:t xml:space="preserve"> |</w:t>
             </w:r>
+            <w:proofErr w:type="spellStart"/>
             <w:r>
               <w:rPr>
                 <w:rFonts w:cs="Arial"/>
@@ -19206,7 +22512,17 @@
                 <w:sz w:val="28"/>
                 <w:szCs w:val="28"/>
               </w:rPr>
-              <w:t>Trikrama correction done.</w:t>
+              <w:t>Trikrama</w:t>
+            </w:r>
+            <w:proofErr w:type="spellEnd"/>
+            <w:r>
+              <w:rPr>
+                <w:rFonts w:cs="Arial"/>
+                <w:color w:val="000000"/>
+                <w:sz w:val="28"/>
+                <w:szCs w:val="28"/>
+              </w:rPr>
+              <w:t xml:space="preserve"> correction done.</w:t>
             </w:r>
             <w:r>
               <w:rPr>
@@ -19234,7 +22550,27 @@
                 <w:sz w:val="28"/>
                 <w:szCs w:val="28"/>
               </w:rPr>
-              <w:t>’ trikramam)</w:t>
+              <w:t xml:space="preserve">’ </w:t>
+            </w:r>
+            <w:proofErr w:type="spellStart"/>
+            <w:r>
+              <w:rPr>
+                <w:rFonts w:cs="Arial"/>
+                <w:color w:val="000000"/>
+                <w:sz w:val="28"/>
+                <w:szCs w:val="28"/>
+              </w:rPr>
+              <w:t>trikramam</w:t>
+            </w:r>
+            <w:proofErr w:type="spellEnd"/>
+            <w:r>
+              <w:rPr>
+                <w:rFonts w:cs="Arial"/>
+                <w:color w:val="000000"/>
+                <w:sz w:val="28"/>
+                <w:szCs w:val="28"/>
+              </w:rPr>
+              <w:t>)</w:t>
             </w:r>
           </w:p>
         </w:tc>
@@ -19249,7 +22585,6 @@
               <w:bottom w:val="single" w:sz="4" w:space="0" w:color="000000"/>
               <w:right w:val="single" w:sz="4" w:space="0" w:color="000000"/>
             </w:tcBorders>
-            <w:shd w:val="clear" w:color="auto" w:fill="auto"/>
           </w:tcPr>
           <w:p>
             <w:pPr>
@@ -19373,7 +22708,6 @@
               <w:bottom w:val="single" w:sz="4" w:space="0" w:color="000000"/>
               <w:right w:val="single" w:sz="4" w:space="0" w:color="000000"/>
             </w:tcBorders>
-            <w:shd w:val="clear" w:color="auto" w:fill="auto"/>
           </w:tcPr>
           <w:p>
             <w:pPr>
@@ -19727,7 +23061,6 @@
               <w:bottom w:val="single" w:sz="4" w:space="0" w:color="000000"/>
               <w:right w:val="single" w:sz="4" w:space="0" w:color="000000"/>
             </w:tcBorders>
-            <w:shd w:val="clear" w:color="auto" w:fill="auto"/>
           </w:tcPr>
           <w:p>
             <w:pPr>
@@ -20025,6 +23358,7 @@
               </w:rPr>
               <w:t>(</w:t>
             </w:r>
+            <w:proofErr w:type="spellStart"/>
             <w:r>
               <w:rPr>
                 <w:rFonts w:cs="Arial"/>
@@ -20032,7 +23366,17 @@
                 <w:sz w:val="28"/>
                 <w:szCs w:val="28"/>
               </w:rPr>
-              <w:t>Trikrama correction done.</w:t>
+              <w:t>Trikrama</w:t>
+            </w:r>
+            <w:proofErr w:type="spellEnd"/>
+            <w:r>
+              <w:rPr>
+                <w:rFonts w:cs="Arial"/>
+                <w:color w:val="000000"/>
+                <w:sz w:val="28"/>
+                <w:szCs w:val="28"/>
+              </w:rPr>
+              <w:t xml:space="preserve"> correction done.</w:t>
             </w:r>
             <w:r>
               <w:rPr>
@@ -20060,7 +23404,27 @@
                 <w:sz w:val="28"/>
                 <w:szCs w:val="28"/>
               </w:rPr>
-              <w:t>’ trikramam)</w:t>
+              <w:t xml:space="preserve">’ </w:t>
+            </w:r>
+            <w:proofErr w:type="spellStart"/>
+            <w:r>
+              <w:rPr>
+                <w:rFonts w:cs="Arial"/>
+                <w:color w:val="000000"/>
+                <w:sz w:val="28"/>
+                <w:szCs w:val="28"/>
+              </w:rPr>
+              <w:t>trikramam</w:t>
+            </w:r>
+            <w:proofErr w:type="spellEnd"/>
+            <w:r>
+              <w:rPr>
+                <w:rFonts w:cs="Arial"/>
+                <w:color w:val="000000"/>
+                <w:sz w:val="28"/>
+                <w:szCs w:val="28"/>
+              </w:rPr>
+              <w:t>)</w:t>
             </w:r>
           </w:p>
         </w:tc>
@@ -20075,7 +23439,6 @@
               <w:bottom w:val="single" w:sz="4" w:space="0" w:color="000000"/>
               <w:right w:val="single" w:sz="4" w:space="0" w:color="000000"/>
             </w:tcBorders>
-            <w:shd w:val="clear" w:color="auto" w:fill="auto"/>
           </w:tcPr>
           <w:p>
             <w:pPr>
@@ -20168,7 +23531,6 @@
               <w:bottom w:val="single" w:sz="4" w:space="0" w:color="000000"/>
               <w:right w:val="single" w:sz="4" w:space="0" w:color="000000"/>
             </w:tcBorders>
-            <w:shd w:val="clear" w:color="auto" w:fill="auto"/>
           </w:tcPr>
           <w:p>
             <w:pPr>
@@ -20407,7 +23769,6 @@
               <w:bottom w:val="single" w:sz="4" w:space="0" w:color="000000"/>
               <w:right w:val="single" w:sz="4" w:space="0" w:color="000000"/>
             </w:tcBorders>
-            <w:shd w:val="clear" w:color="auto" w:fill="auto"/>
           </w:tcPr>
           <w:p>
             <w:pPr>
@@ -20692,6 +24053,7 @@
               </w:rPr>
               <w:t>(</w:t>
             </w:r>
+            <w:proofErr w:type="spellStart"/>
             <w:r>
               <w:rPr>
                 <w:rFonts w:cs="Arial"/>
@@ -20699,7 +24061,17 @@
                 <w:sz w:val="28"/>
                 <w:szCs w:val="28"/>
               </w:rPr>
-              <w:t>Trikrama correction done.</w:t>
+              <w:t>Trikrama</w:t>
+            </w:r>
+            <w:proofErr w:type="spellEnd"/>
+            <w:r>
+              <w:rPr>
+                <w:rFonts w:cs="Arial"/>
+                <w:color w:val="000000"/>
+                <w:sz w:val="28"/>
+                <w:szCs w:val="28"/>
+              </w:rPr>
+              <w:t xml:space="preserve"> correction done.</w:t>
             </w:r>
             <w:r>
               <w:rPr>
@@ -20727,7 +24099,27 @@
                 <w:sz w:val="28"/>
                 <w:szCs w:val="28"/>
               </w:rPr>
-              <w:t>’ trikramam)</w:t>
+              <w:t xml:space="preserve">’ </w:t>
+            </w:r>
+            <w:proofErr w:type="spellStart"/>
+            <w:r>
+              <w:rPr>
+                <w:rFonts w:cs="Arial"/>
+                <w:color w:val="000000"/>
+                <w:sz w:val="28"/>
+                <w:szCs w:val="28"/>
+              </w:rPr>
+              <w:t>trikramam</w:t>
+            </w:r>
+            <w:proofErr w:type="spellEnd"/>
+            <w:r>
+              <w:rPr>
+                <w:rFonts w:cs="Arial"/>
+                <w:color w:val="000000"/>
+                <w:sz w:val="28"/>
+                <w:szCs w:val="28"/>
+              </w:rPr>
+              <w:t>)</w:t>
             </w:r>
           </w:p>
         </w:tc>
@@ -20761,29 +24153,7 @@
           <w:szCs w:val="32"/>
           <w:u w:val="single"/>
         </w:rPr>
-        <w:t xml:space="preserve">TS Krama Paatam – TS 7.1 </w:t>
-      </w:r>
-      <w:proofErr w:type="gramStart"/>
-      <w:r>
-        <w:rPr>
-          <w:b/>
-          <w:bCs/>
-          <w:sz w:val="32"/>
-          <w:szCs w:val="32"/>
-          <w:u w:val="single"/>
-        </w:rPr>
-        <w:t>Tamil  Corrections</w:t>
-      </w:r>
-      <w:proofErr w:type="gramEnd"/>
-      <w:r>
-        <w:rPr>
-          <w:b/>
-          <w:bCs/>
-          <w:sz w:val="32"/>
-          <w:szCs w:val="32"/>
-          <w:u w:val="single"/>
-        </w:rPr>
-        <w:t xml:space="preserve"> –Observed </w:t>
+        <w:t xml:space="preserve">TS Krama Paatam – TS 7.1 Tamil  Corrections –Observed </w:t>
       </w:r>
       <w:r>
         <w:rPr>
@@ -21139,7 +24509,7 @@
 </file>
 
 <file path=word/endnotes.xml><?xml version="1.0" encoding="utf-8"?>
-<w:endnotes xmlns:wpc="http://schemas.microsoft.com/office/word/2010/wordprocessingCanvas" xmlns:cx="http://schemas.microsoft.com/office/drawing/2014/chartex" xmlns:cx1="http://schemas.microsoft.com/office/drawing/2015/9/8/chartex" xmlns:cx2="http://schemas.microsoft.com/office/drawing/2015/10/21/chartex" xmlns:cx3="http://schemas.microsoft.com/office/drawing/2016/5/9/chartex" xmlns:cx4="http://schemas.microsoft.com/office/drawing/2016/5/10/chartex" xmlns:cx5="http://schemas.microsoft.com/office/drawing/2016/5/11/chartex" xmlns:cx6="http://schemas.microsoft.com/office/drawing/2016/5/12/chartex" xmlns:cx7="http://schemas.microsoft.com/office/drawing/2016/5/13/chartex" xmlns:cx8="http://schemas.microsoft.com/office/drawing/2016/5/14/chartex" xmlns:mc="http://schemas.openxmlformats.org/markup-compatibility/2006" xmlns:aink="http://schemas.microsoft.com/office/drawing/2016/ink" xmlns:am3d="http://schemas.microsoft.com/office/drawing/2017/model3d" xmlns:o="urn:schemas-microsoft-com:office:office" xmlns:oel="http://schemas.microsoft.com/office/2019/extlst" xmlns:r="http://schemas.openxmlformats.org/officeDocument/2006/relationships" xmlns:m="http://schemas.openxmlformats.org/officeDocument/2006/math" xmlns:v="urn:schemas-microsoft-com:vml" xmlns:wp14="http://schemas.microsoft.com/office/word/2010/wordprocessingDrawing" xmlns:wp="http://schemas.openxmlformats.org/drawingml/2006/wordprocessingDrawing" xmlns:w10="urn:schemas-microsoft-com:office:word" xmlns:w="http://schemas.openxmlformats.org/wordprocessingml/2006/main" xmlns:w14="http://schemas.microsoft.com/office/word/2010/wordml" xmlns:w15="http://schemas.microsoft.com/office/word/2012/wordml" xmlns:w16cex="http://schemas.microsoft.com/office/word/2018/wordml/cex" xmlns:w16cid="http://schemas.microsoft.com/office/word/2016/wordml/cid" xmlns:w16="http://schemas.microsoft.com/office/word/2018/wordml" xmlns:w16sdtdh="http://schemas.microsoft.com/office/word/2020/wordml/sdtdatahash" xmlns:w16se="http://schemas.microsoft.com/office/word/2015/wordml/symex" xmlns:wpg="http://schemas.microsoft.com/office/word/2010/wordprocessingGroup" xmlns:wpi="http://schemas.microsoft.com/office/word/2010/wordprocessingInk" xmlns:wne="http://schemas.microsoft.com/office/word/2006/wordml" xmlns:wps="http://schemas.microsoft.com/office/word/2010/wordprocessingShape" mc:Ignorable="w14 w15 w16se w16cid w16 w16cex w16sdtdh wp14">
+<w:endnotes xmlns:wpc="http://schemas.microsoft.com/office/word/2010/wordprocessingCanvas" xmlns:cx="http://schemas.microsoft.com/office/drawing/2014/chartex" xmlns:cx1="http://schemas.microsoft.com/office/drawing/2015/9/8/chartex" xmlns:cx2="http://schemas.microsoft.com/office/drawing/2015/10/21/chartex" xmlns:cx3="http://schemas.microsoft.com/office/drawing/2016/5/9/chartex" xmlns:cx4="http://schemas.microsoft.com/office/drawing/2016/5/10/chartex" xmlns:cx5="http://schemas.microsoft.com/office/drawing/2016/5/11/chartex" xmlns:cx6="http://schemas.microsoft.com/office/drawing/2016/5/12/chartex" xmlns:cx7="http://schemas.microsoft.com/office/drawing/2016/5/13/chartex" xmlns:cx8="http://schemas.microsoft.com/office/drawing/2016/5/14/chartex" xmlns:mc="http://schemas.openxmlformats.org/markup-compatibility/2006" xmlns:aink="http://schemas.microsoft.com/office/drawing/2016/ink" xmlns:am3d="http://schemas.microsoft.com/office/drawing/2017/model3d" xmlns:o="urn:schemas-microsoft-com:office:office" xmlns:oel="http://schemas.microsoft.com/office/2019/extlst" xmlns:r="http://schemas.openxmlformats.org/officeDocument/2006/relationships" xmlns:m="http://schemas.openxmlformats.org/officeDocument/2006/math" xmlns:v="urn:schemas-microsoft-com:vml" xmlns:wp14="http://schemas.microsoft.com/office/word/2010/wordprocessingDrawing" xmlns:wp="http://schemas.openxmlformats.org/drawingml/2006/wordprocessingDrawing" xmlns:w10="urn:schemas-microsoft-com:office:word" xmlns:w="http://schemas.openxmlformats.org/wordprocessingml/2006/main" xmlns:w14="http://schemas.microsoft.com/office/word/2010/wordml" xmlns:w15="http://schemas.microsoft.com/office/word/2012/wordml" xmlns:w16cex="http://schemas.microsoft.com/office/word/2018/wordml/cex" xmlns:w16cid="http://schemas.microsoft.com/office/word/2016/wordml/cid" xmlns:w16="http://schemas.microsoft.com/office/word/2018/wordml" xmlns:w16du="http://schemas.microsoft.com/office/word/2023/wordml/word16du" xmlns:w16sdtdh="http://schemas.microsoft.com/office/word/2020/wordml/sdtdatahash" xmlns:w16sdtfl="http://schemas.microsoft.com/office/word/2024/wordml/sdtformatlock" xmlns:w16se="http://schemas.microsoft.com/office/word/2015/wordml/symex" xmlns:wpg="http://schemas.microsoft.com/office/word/2010/wordprocessingGroup" xmlns:wpi="http://schemas.microsoft.com/office/word/2010/wordprocessingInk" xmlns:wne="http://schemas.microsoft.com/office/word/2006/wordml" xmlns:wps="http://schemas.microsoft.com/office/word/2010/wordprocessingShape" mc:Ignorable="w14 w15 w16se w16cid w16 w16cex w16sdtdh w16sdtfl w16du wp14">
   <w:endnote w:type="separator" w:id="-1">
     <w:p>
       <w:pPr>
@@ -21164,7 +24534,7 @@
 </file>
 
 <file path=word/footer1.xml><?xml version="1.0" encoding="utf-8"?>
-<w:ftr xmlns:wpc="http://schemas.microsoft.com/office/word/2010/wordprocessingCanvas" xmlns:cx="http://schemas.microsoft.com/office/drawing/2014/chartex" xmlns:cx1="http://schemas.microsoft.com/office/drawing/2015/9/8/chartex" xmlns:cx2="http://schemas.microsoft.com/office/drawing/2015/10/21/chartex" xmlns:cx3="http://schemas.microsoft.com/office/drawing/2016/5/9/chartex" xmlns:cx4="http://schemas.microsoft.com/office/drawing/2016/5/10/chartex" xmlns:cx5="http://schemas.microsoft.com/office/drawing/2016/5/11/chartex" xmlns:cx6="http://schemas.microsoft.com/office/drawing/2016/5/12/chartex" xmlns:cx7="http://schemas.microsoft.com/office/drawing/2016/5/13/chartex" xmlns:cx8="http://schemas.microsoft.com/office/drawing/2016/5/14/chartex" xmlns:mc="http://schemas.openxmlformats.org/markup-compatibility/2006" xmlns:aink="http://schemas.microsoft.com/office/drawing/2016/ink" xmlns:am3d="http://schemas.microsoft.com/office/drawing/2017/model3d" xmlns:o="urn:schemas-microsoft-com:office:office" xmlns:oel="http://schemas.microsoft.com/office/2019/extlst" xmlns:r="http://schemas.openxmlformats.org/officeDocument/2006/relationships" xmlns:m="http://schemas.openxmlformats.org/officeDocument/2006/math" xmlns:v="urn:schemas-microsoft-com:vml" xmlns:wp14="http://schemas.microsoft.com/office/word/2010/wordprocessingDrawing" xmlns:wp="http://schemas.openxmlformats.org/drawingml/2006/wordprocessingDrawing" xmlns:w10="urn:schemas-microsoft-com:office:word" xmlns:w="http://schemas.openxmlformats.org/wordprocessingml/2006/main" xmlns:w14="http://schemas.microsoft.com/office/word/2010/wordml" xmlns:w15="http://schemas.microsoft.com/office/word/2012/wordml" xmlns:w16cex="http://schemas.microsoft.com/office/word/2018/wordml/cex" xmlns:w16cid="http://schemas.microsoft.com/office/word/2016/wordml/cid" xmlns:w16="http://schemas.microsoft.com/office/word/2018/wordml" xmlns:w16sdtdh="http://schemas.microsoft.com/office/word/2020/wordml/sdtdatahash" xmlns:w16se="http://schemas.microsoft.com/office/word/2015/wordml/symex" xmlns:wpg="http://schemas.microsoft.com/office/word/2010/wordprocessingGroup" xmlns:wpi="http://schemas.microsoft.com/office/word/2010/wordprocessingInk" xmlns:wne="http://schemas.microsoft.com/office/word/2006/wordml" xmlns:wps="http://schemas.microsoft.com/office/word/2010/wordprocessingShape" mc:Ignorable="w14 w15 w16se w16cid w16 w16cex w16sdtdh wp14">
+<w:ftr xmlns:wpc="http://schemas.microsoft.com/office/word/2010/wordprocessingCanvas" xmlns:cx="http://schemas.microsoft.com/office/drawing/2014/chartex" xmlns:cx1="http://schemas.microsoft.com/office/drawing/2015/9/8/chartex" xmlns:cx2="http://schemas.microsoft.com/office/drawing/2015/10/21/chartex" xmlns:cx3="http://schemas.microsoft.com/office/drawing/2016/5/9/chartex" xmlns:cx4="http://schemas.microsoft.com/office/drawing/2016/5/10/chartex" xmlns:cx5="http://schemas.microsoft.com/office/drawing/2016/5/11/chartex" xmlns:cx6="http://schemas.microsoft.com/office/drawing/2016/5/12/chartex" xmlns:cx7="http://schemas.microsoft.com/office/drawing/2016/5/13/chartex" xmlns:cx8="http://schemas.microsoft.com/office/drawing/2016/5/14/chartex" xmlns:mc="http://schemas.openxmlformats.org/markup-compatibility/2006" xmlns:aink="http://schemas.microsoft.com/office/drawing/2016/ink" xmlns:am3d="http://schemas.microsoft.com/office/drawing/2017/model3d" xmlns:o="urn:schemas-microsoft-com:office:office" xmlns:oel="http://schemas.microsoft.com/office/2019/extlst" xmlns:r="http://schemas.openxmlformats.org/officeDocument/2006/relationships" xmlns:m="http://schemas.openxmlformats.org/officeDocument/2006/math" xmlns:v="urn:schemas-microsoft-com:vml" xmlns:wp14="http://schemas.microsoft.com/office/word/2010/wordprocessingDrawing" xmlns:wp="http://schemas.openxmlformats.org/drawingml/2006/wordprocessingDrawing" xmlns:w10="urn:schemas-microsoft-com:office:word" xmlns:w="http://schemas.openxmlformats.org/wordprocessingml/2006/main" xmlns:w14="http://schemas.microsoft.com/office/word/2010/wordml" xmlns:w15="http://schemas.microsoft.com/office/word/2012/wordml" xmlns:w16cex="http://schemas.microsoft.com/office/word/2018/wordml/cex" xmlns:w16cid="http://schemas.microsoft.com/office/word/2016/wordml/cid" xmlns:w16="http://schemas.microsoft.com/office/word/2018/wordml" xmlns:w16du="http://schemas.microsoft.com/office/word/2023/wordml/word16du" xmlns:w16sdtdh="http://schemas.microsoft.com/office/word/2020/wordml/sdtdatahash" xmlns:w16sdtfl="http://schemas.microsoft.com/office/word/2024/wordml/sdtformatlock" xmlns:w16se="http://schemas.microsoft.com/office/word/2015/wordml/symex" xmlns:wpg="http://schemas.microsoft.com/office/word/2010/wordprocessingGroup" xmlns:wpi="http://schemas.microsoft.com/office/word/2010/wordprocessingInk" xmlns:wne="http://schemas.microsoft.com/office/word/2006/wordml" xmlns:wps="http://schemas.microsoft.com/office/word/2010/wordprocessingShape" mc:Ignorable="w14 w15 w16se w16cid w16 w16cex w16sdtdh w16sdtfl w16du wp14">
   <w:p>
     <w:pPr>
       <w:pStyle w:val="Footer"/>
@@ -21302,7 +24672,7 @@
 </file>
 
 <file path=word/footer2.xml><?xml version="1.0" encoding="utf-8"?>
-<w:ftr xmlns:wpc="http://schemas.microsoft.com/office/word/2010/wordprocessingCanvas" xmlns:cx="http://schemas.microsoft.com/office/drawing/2014/chartex" xmlns:cx1="http://schemas.microsoft.com/office/drawing/2015/9/8/chartex" xmlns:cx2="http://schemas.microsoft.com/office/drawing/2015/10/21/chartex" xmlns:cx3="http://schemas.microsoft.com/office/drawing/2016/5/9/chartex" xmlns:cx4="http://schemas.microsoft.com/office/drawing/2016/5/10/chartex" xmlns:cx5="http://schemas.microsoft.com/office/drawing/2016/5/11/chartex" xmlns:cx6="http://schemas.microsoft.com/office/drawing/2016/5/12/chartex" xmlns:cx7="http://schemas.microsoft.com/office/drawing/2016/5/13/chartex" xmlns:cx8="http://schemas.microsoft.com/office/drawing/2016/5/14/chartex" xmlns:mc="http://schemas.openxmlformats.org/markup-compatibility/2006" xmlns:aink="http://schemas.microsoft.com/office/drawing/2016/ink" xmlns:am3d="http://schemas.microsoft.com/office/drawing/2017/model3d" xmlns:o="urn:schemas-microsoft-com:office:office" xmlns:oel="http://schemas.microsoft.com/office/2019/extlst" xmlns:r="http://schemas.openxmlformats.org/officeDocument/2006/relationships" xmlns:m="http://schemas.openxmlformats.org/officeDocument/2006/math" xmlns:v="urn:schemas-microsoft-com:vml" xmlns:wp14="http://schemas.microsoft.com/office/word/2010/wordprocessingDrawing" xmlns:wp="http://schemas.openxmlformats.org/drawingml/2006/wordprocessingDrawing" xmlns:w10="urn:schemas-microsoft-com:office:word" xmlns:w="http://schemas.openxmlformats.org/wordprocessingml/2006/main" xmlns:w14="http://schemas.microsoft.com/office/word/2010/wordml" xmlns:w15="http://schemas.microsoft.com/office/word/2012/wordml" xmlns:w16cex="http://schemas.microsoft.com/office/word/2018/wordml/cex" xmlns:w16cid="http://schemas.microsoft.com/office/word/2016/wordml/cid" xmlns:w16="http://schemas.microsoft.com/office/word/2018/wordml" xmlns:w16sdtdh="http://schemas.microsoft.com/office/word/2020/wordml/sdtdatahash" xmlns:w16se="http://schemas.microsoft.com/office/word/2015/wordml/symex" xmlns:wpg="http://schemas.microsoft.com/office/word/2010/wordprocessingGroup" xmlns:wpi="http://schemas.microsoft.com/office/word/2010/wordprocessingInk" xmlns:wne="http://schemas.microsoft.com/office/word/2006/wordml" xmlns:wps="http://schemas.microsoft.com/office/word/2010/wordprocessingShape" mc:Ignorable="w14 w15 w16se w16cid w16 w16cex w16sdtdh wp14">
+<w:ftr xmlns:wpc="http://schemas.microsoft.com/office/word/2010/wordprocessingCanvas" xmlns:cx="http://schemas.microsoft.com/office/drawing/2014/chartex" xmlns:cx1="http://schemas.microsoft.com/office/drawing/2015/9/8/chartex" xmlns:cx2="http://schemas.microsoft.com/office/drawing/2015/10/21/chartex" xmlns:cx3="http://schemas.microsoft.com/office/drawing/2016/5/9/chartex" xmlns:cx4="http://schemas.microsoft.com/office/drawing/2016/5/10/chartex" xmlns:cx5="http://schemas.microsoft.com/office/drawing/2016/5/11/chartex" xmlns:cx6="http://schemas.microsoft.com/office/drawing/2016/5/12/chartex" xmlns:cx7="http://schemas.microsoft.com/office/drawing/2016/5/13/chartex" xmlns:cx8="http://schemas.microsoft.com/office/drawing/2016/5/14/chartex" xmlns:mc="http://schemas.openxmlformats.org/markup-compatibility/2006" xmlns:aink="http://schemas.microsoft.com/office/drawing/2016/ink" xmlns:am3d="http://schemas.microsoft.com/office/drawing/2017/model3d" xmlns:o="urn:schemas-microsoft-com:office:office" xmlns:oel="http://schemas.microsoft.com/office/2019/extlst" xmlns:r="http://schemas.openxmlformats.org/officeDocument/2006/relationships" xmlns:m="http://schemas.openxmlformats.org/officeDocument/2006/math" xmlns:v="urn:schemas-microsoft-com:vml" xmlns:wp14="http://schemas.microsoft.com/office/word/2010/wordprocessingDrawing" xmlns:wp="http://schemas.openxmlformats.org/drawingml/2006/wordprocessingDrawing" xmlns:w10="urn:schemas-microsoft-com:office:word" xmlns:w="http://schemas.openxmlformats.org/wordprocessingml/2006/main" xmlns:w14="http://schemas.microsoft.com/office/word/2010/wordml" xmlns:w15="http://schemas.microsoft.com/office/word/2012/wordml" xmlns:w16cex="http://schemas.microsoft.com/office/word/2018/wordml/cex" xmlns:w16cid="http://schemas.microsoft.com/office/word/2016/wordml/cid" xmlns:w16="http://schemas.microsoft.com/office/word/2018/wordml" xmlns:w16du="http://schemas.microsoft.com/office/word/2023/wordml/word16du" xmlns:w16sdtdh="http://schemas.microsoft.com/office/word/2020/wordml/sdtdatahash" xmlns:w16sdtfl="http://schemas.microsoft.com/office/word/2024/wordml/sdtformatlock" xmlns:w16se="http://schemas.microsoft.com/office/word/2015/wordml/symex" xmlns:wpg="http://schemas.microsoft.com/office/word/2010/wordprocessingGroup" xmlns:wpi="http://schemas.microsoft.com/office/word/2010/wordprocessingInk" xmlns:wne="http://schemas.microsoft.com/office/word/2006/wordml" xmlns:wps="http://schemas.microsoft.com/office/word/2010/wordprocessingShape" mc:Ignorable="w14 w15 w16se w16cid w16 w16cex w16sdtdh w16sdtfl w16du wp14">
   <w:p>
     <w:pPr>
       <w:pBdr>
@@ -21501,7 +24871,7 @@
 </file>
 
 <file path=word/footnotes.xml><?xml version="1.0" encoding="utf-8"?>
-<w:footnotes xmlns:wpc="http://schemas.microsoft.com/office/word/2010/wordprocessingCanvas" xmlns:cx="http://schemas.microsoft.com/office/drawing/2014/chartex" xmlns:cx1="http://schemas.microsoft.com/office/drawing/2015/9/8/chartex" xmlns:cx2="http://schemas.microsoft.com/office/drawing/2015/10/21/chartex" xmlns:cx3="http://schemas.microsoft.com/office/drawing/2016/5/9/chartex" xmlns:cx4="http://schemas.microsoft.com/office/drawing/2016/5/10/chartex" xmlns:cx5="http://schemas.microsoft.com/office/drawing/2016/5/11/chartex" xmlns:cx6="http://schemas.microsoft.com/office/drawing/2016/5/12/chartex" xmlns:cx7="http://schemas.microsoft.com/office/drawing/2016/5/13/chartex" xmlns:cx8="http://schemas.microsoft.com/office/drawing/2016/5/14/chartex" xmlns:mc="http://schemas.openxmlformats.org/markup-compatibility/2006" xmlns:aink="http://schemas.microsoft.com/office/drawing/2016/ink" xmlns:am3d="http://schemas.microsoft.com/office/drawing/2017/model3d" xmlns:o="urn:schemas-microsoft-com:office:office" xmlns:oel="http://schemas.microsoft.com/office/2019/extlst" xmlns:r="http://schemas.openxmlformats.org/officeDocument/2006/relationships" xmlns:m="http://schemas.openxmlformats.org/officeDocument/2006/math" xmlns:v="urn:schemas-microsoft-com:vml" xmlns:wp14="http://schemas.microsoft.com/office/word/2010/wordprocessingDrawing" xmlns:wp="http://schemas.openxmlformats.org/drawingml/2006/wordprocessingDrawing" xmlns:w10="urn:schemas-microsoft-com:office:word" xmlns:w="http://schemas.openxmlformats.org/wordprocessingml/2006/main" xmlns:w14="http://schemas.microsoft.com/office/word/2010/wordml" xmlns:w15="http://schemas.microsoft.com/office/word/2012/wordml" xmlns:w16cex="http://schemas.microsoft.com/office/word/2018/wordml/cex" xmlns:w16cid="http://schemas.microsoft.com/office/word/2016/wordml/cid" xmlns:w16="http://schemas.microsoft.com/office/word/2018/wordml" xmlns:w16sdtdh="http://schemas.microsoft.com/office/word/2020/wordml/sdtdatahash" xmlns:w16se="http://schemas.microsoft.com/office/word/2015/wordml/symex" xmlns:wpg="http://schemas.microsoft.com/office/word/2010/wordprocessingGroup" xmlns:wpi="http://schemas.microsoft.com/office/word/2010/wordprocessingInk" xmlns:wne="http://schemas.microsoft.com/office/word/2006/wordml" xmlns:wps="http://schemas.microsoft.com/office/word/2010/wordprocessingShape" mc:Ignorable="w14 w15 w16se w16cid w16 w16cex w16sdtdh wp14">
+<w:footnotes xmlns:wpc="http://schemas.microsoft.com/office/word/2010/wordprocessingCanvas" xmlns:cx="http://schemas.microsoft.com/office/drawing/2014/chartex" xmlns:cx1="http://schemas.microsoft.com/office/drawing/2015/9/8/chartex" xmlns:cx2="http://schemas.microsoft.com/office/drawing/2015/10/21/chartex" xmlns:cx3="http://schemas.microsoft.com/office/drawing/2016/5/9/chartex" xmlns:cx4="http://schemas.microsoft.com/office/drawing/2016/5/10/chartex" xmlns:cx5="http://schemas.microsoft.com/office/drawing/2016/5/11/chartex" xmlns:cx6="http://schemas.microsoft.com/office/drawing/2016/5/12/chartex" xmlns:cx7="http://schemas.microsoft.com/office/drawing/2016/5/13/chartex" xmlns:cx8="http://schemas.microsoft.com/office/drawing/2016/5/14/chartex" xmlns:mc="http://schemas.openxmlformats.org/markup-compatibility/2006" xmlns:aink="http://schemas.microsoft.com/office/drawing/2016/ink" xmlns:am3d="http://schemas.microsoft.com/office/drawing/2017/model3d" xmlns:o="urn:schemas-microsoft-com:office:office" xmlns:oel="http://schemas.microsoft.com/office/2019/extlst" xmlns:r="http://schemas.openxmlformats.org/officeDocument/2006/relationships" xmlns:m="http://schemas.openxmlformats.org/officeDocument/2006/math" xmlns:v="urn:schemas-microsoft-com:vml" xmlns:wp14="http://schemas.microsoft.com/office/word/2010/wordprocessingDrawing" xmlns:wp="http://schemas.openxmlformats.org/drawingml/2006/wordprocessingDrawing" xmlns:w10="urn:schemas-microsoft-com:office:word" xmlns:w="http://schemas.openxmlformats.org/wordprocessingml/2006/main" xmlns:w14="http://schemas.microsoft.com/office/word/2010/wordml" xmlns:w15="http://schemas.microsoft.com/office/word/2012/wordml" xmlns:w16cex="http://schemas.microsoft.com/office/word/2018/wordml/cex" xmlns:w16cid="http://schemas.microsoft.com/office/word/2016/wordml/cid" xmlns:w16="http://schemas.microsoft.com/office/word/2018/wordml" xmlns:w16du="http://schemas.microsoft.com/office/word/2023/wordml/word16du" xmlns:w16sdtdh="http://schemas.microsoft.com/office/word/2020/wordml/sdtdatahash" xmlns:w16sdtfl="http://schemas.microsoft.com/office/word/2024/wordml/sdtformatlock" xmlns:w16se="http://schemas.microsoft.com/office/word/2015/wordml/symex" xmlns:wpg="http://schemas.microsoft.com/office/word/2010/wordprocessingGroup" xmlns:wpi="http://schemas.microsoft.com/office/word/2010/wordprocessingInk" xmlns:wne="http://schemas.microsoft.com/office/word/2006/wordml" xmlns:wps="http://schemas.microsoft.com/office/word/2010/wordprocessingShape" mc:Ignorable="w14 w15 w16se w16cid w16 w16cex w16sdtdh w16sdtfl w16du wp14">
   <w:footnote w:type="separator" w:id="-1">
     <w:p>
       <w:pPr>
@@ -21526,7 +24896,7 @@
 </file>
 
 <file path=word/header1.xml><?xml version="1.0" encoding="utf-8"?>
-<w:hdr xmlns:wpc="http://schemas.microsoft.com/office/word/2010/wordprocessingCanvas" xmlns:cx="http://schemas.microsoft.com/office/drawing/2014/chartex" xmlns:cx1="http://schemas.microsoft.com/office/drawing/2015/9/8/chartex" xmlns:cx2="http://schemas.microsoft.com/office/drawing/2015/10/21/chartex" xmlns:cx3="http://schemas.microsoft.com/office/drawing/2016/5/9/chartex" xmlns:cx4="http://schemas.microsoft.com/office/drawing/2016/5/10/chartex" xmlns:cx5="http://schemas.microsoft.com/office/drawing/2016/5/11/chartex" xmlns:cx6="http://schemas.microsoft.com/office/drawing/2016/5/12/chartex" xmlns:cx7="http://schemas.microsoft.com/office/drawing/2016/5/13/chartex" xmlns:cx8="http://schemas.microsoft.com/office/drawing/2016/5/14/chartex" xmlns:mc="http://schemas.openxmlformats.org/markup-compatibility/2006" xmlns:aink="http://schemas.microsoft.com/office/drawing/2016/ink" xmlns:am3d="http://schemas.microsoft.com/office/drawing/2017/model3d" xmlns:o="urn:schemas-microsoft-com:office:office" xmlns:oel="http://schemas.microsoft.com/office/2019/extlst" xmlns:r="http://schemas.openxmlformats.org/officeDocument/2006/relationships" xmlns:m="http://schemas.openxmlformats.org/officeDocument/2006/math" xmlns:v="urn:schemas-microsoft-com:vml" xmlns:wp14="http://schemas.microsoft.com/office/word/2010/wordprocessingDrawing" xmlns:wp="http://schemas.openxmlformats.org/drawingml/2006/wordprocessingDrawing" xmlns:w10="urn:schemas-microsoft-com:office:word" xmlns:w="http://schemas.openxmlformats.org/wordprocessingml/2006/main" xmlns:w14="http://schemas.microsoft.com/office/word/2010/wordml" xmlns:w15="http://schemas.microsoft.com/office/word/2012/wordml" xmlns:w16cex="http://schemas.microsoft.com/office/word/2018/wordml/cex" xmlns:w16cid="http://schemas.microsoft.com/office/word/2016/wordml/cid" xmlns:w16="http://schemas.microsoft.com/office/word/2018/wordml" xmlns:w16sdtdh="http://schemas.microsoft.com/office/word/2020/wordml/sdtdatahash" xmlns:w16se="http://schemas.microsoft.com/office/word/2015/wordml/symex" xmlns:wpg="http://schemas.microsoft.com/office/word/2010/wordprocessingGroup" xmlns:wpi="http://schemas.microsoft.com/office/word/2010/wordprocessingInk" xmlns:wne="http://schemas.microsoft.com/office/word/2006/wordml" xmlns:wps="http://schemas.microsoft.com/office/word/2010/wordprocessingShape" mc:Ignorable="w14 w15 w16se w16cid w16 w16cex w16sdtdh wp14">
+<w:hdr xmlns:wpc="http://schemas.microsoft.com/office/word/2010/wordprocessingCanvas" xmlns:cx="http://schemas.microsoft.com/office/drawing/2014/chartex" xmlns:cx1="http://schemas.microsoft.com/office/drawing/2015/9/8/chartex" xmlns:cx2="http://schemas.microsoft.com/office/drawing/2015/10/21/chartex" xmlns:cx3="http://schemas.microsoft.com/office/drawing/2016/5/9/chartex" xmlns:cx4="http://schemas.microsoft.com/office/drawing/2016/5/10/chartex" xmlns:cx5="http://schemas.microsoft.com/office/drawing/2016/5/11/chartex" xmlns:cx6="http://schemas.microsoft.com/office/drawing/2016/5/12/chartex" xmlns:cx7="http://schemas.microsoft.com/office/drawing/2016/5/13/chartex" xmlns:cx8="http://schemas.microsoft.com/office/drawing/2016/5/14/chartex" xmlns:mc="http://schemas.openxmlformats.org/markup-compatibility/2006" xmlns:aink="http://schemas.microsoft.com/office/drawing/2016/ink" xmlns:am3d="http://schemas.microsoft.com/office/drawing/2017/model3d" xmlns:o="urn:schemas-microsoft-com:office:office" xmlns:oel="http://schemas.microsoft.com/office/2019/extlst" xmlns:r="http://schemas.openxmlformats.org/officeDocument/2006/relationships" xmlns:m="http://schemas.openxmlformats.org/officeDocument/2006/math" xmlns:v="urn:schemas-microsoft-com:vml" xmlns:wp14="http://schemas.microsoft.com/office/word/2010/wordprocessingDrawing" xmlns:wp="http://schemas.openxmlformats.org/drawingml/2006/wordprocessingDrawing" xmlns:w10="urn:schemas-microsoft-com:office:word" xmlns:w="http://schemas.openxmlformats.org/wordprocessingml/2006/main" xmlns:w14="http://schemas.microsoft.com/office/word/2010/wordml" xmlns:w15="http://schemas.microsoft.com/office/word/2012/wordml" xmlns:w16cex="http://schemas.microsoft.com/office/word/2018/wordml/cex" xmlns:w16cid="http://schemas.microsoft.com/office/word/2016/wordml/cid" xmlns:w16="http://schemas.microsoft.com/office/word/2018/wordml" xmlns:w16du="http://schemas.microsoft.com/office/word/2023/wordml/word16du" xmlns:w16sdtdh="http://schemas.microsoft.com/office/word/2020/wordml/sdtdatahash" xmlns:w16sdtfl="http://schemas.microsoft.com/office/word/2024/wordml/sdtformatlock" xmlns:w16se="http://schemas.microsoft.com/office/word/2015/wordml/symex" xmlns:wpg="http://schemas.microsoft.com/office/word/2010/wordprocessingGroup" xmlns:wpi="http://schemas.microsoft.com/office/word/2010/wordprocessingInk" xmlns:wne="http://schemas.microsoft.com/office/word/2006/wordml" xmlns:wps="http://schemas.microsoft.com/office/word/2010/wordprocessingShape" mc:Ignorable="w14 w15 w16se w16cid w16 w16cex w16sdtdh w16sdtfl w16du wp14">
   <w:p>
     <w:pPr>
       <w:pStyle w:val="Header"/>
@@ -21539,7 +24909,7 @@
 </file>
 
 <file path=word/header2.xml><?xml version="1.0" encoding="utf-8"?>
-<w:hdr xmlns:wpc="http://schemas.microsoft.com/office/word/2010/wordprocessingCanvas" xmlns:cx="http://schemas.microsoft.com/office/drawing/2014/chartex" xmlns:cx1="http://schemas.microsoft.com/office/drawing/2015/9/8/chartex" xmlns:cx2="http://schemas.microsoft.com/office/drawing/2015/10/21/chartex" xmlns:cx3="http://schemas.microsoft.com/office/drawing/2016/5/9/chartex" xmlns:cx4="http://schemas.microsoft.com/office/drawing/2016/5/10/chartex" xmlns:cx5="http://schemas.microsoft.com/office/drawing/2016/5/11/chartex" xmlns:cx6="http://schemas.microsoft.com/office/drawing/2016/5/12/chartex" xmlns:cx7="http://schemas.microsoft.com/office/drawing/2016/5/13/chartex" xmlns:cx8="http://schemas.microsoft.com/office/drawing/2016/5/14/chartex" xmlns:mc="http://schemas.openxmlformats.org/markup-compatibility/2006" xmlns:aink="http://schemas.microsoft.com/office/drawing/2016/ink" xmlns:am3d="http://schemas.microsoft.com/office/drawing/2017/model3d" xmlns:o="urn:schemas-microsoft-com:office:office" xmlns:oel="http://schemas.microsoft.com/office/2019/extlst" xmlns:r="http://schemas.openxmlformats.org/officeDocument/2006/relationships" xmlns:m="http://schemas.openxmlformats.org/officeDocument/2006/math" xmlns:v="urn:schemas-microsoft-com:vml" xmlns:wp14="http://schemas.microsoft.com/office/word/2010/wordprocessingDrawing" xmlns:wp="http://schemas.openxmlformats.org/drawingml/2006/wordprocessingDrawing" xmlns:w10="urn:schemas-microsoft-com:office:word" xmlns:w="http://schemas.openxmlformats.org/wordprocessingml/2006/main" xmlns:w14="http://schemas.microsoft.com/office/word/2010/wordml" xmlns:w15="http://schemas.microsoft.com/office/word/2012/wordml" xmlns:w16cex="http://schemas.microsoft.com/office/word/2018/wordml/cex" xmlns:w16cid="http://schemas.microsoft.com/office/word/2016/wordml/cid" xmlns:w16="http://schemas.microsoft.com/office/word/2018/wordml" xmlns:w16sdtdh="http://schemas.microsoft.com/office/word/2020/wordml/sdtdatahash" xmlns:w16se="http://schemas.microsoft.com/office/word/2015/wordml/symex" xmlns:wpg="http://schemas.microsoft.com/office/word/2010/wordprocessingGroup" xmlns:wpi="http://schemas.microsoft.com/office/word/2010/wordprocessingInk" xmlns:wne="http://schemas.microsoft.com/office/word/2006/wordml" xmlns:wps="http://schemas.microsoft.com/office/word/2010/wordprocessingShape" mc:Ignorable="w14 w15 w16se w16cid w16 w16cex w16sdtdh wp14">
+<w:hdr xmlns:wpc="http://schemas.microsoft.com/office/word/2010/wordprocessingCanvas" xmlns:cx="http://schemas.microsoft.com/office/drawing/2014/chartex" xmlns:cx1="http://schemas.microsoft.com/office/drawing/2015/9/8/chartex" xmlns:cx2="http://schemas.microsoft.com/office/drawing/2015/10/21/chartex" xmlns:cx3="http://schemas.microsoft.com/office/drawing/2016/5/9/chartex" xmlns:cx4="http://schemas.microsoft.com/office/drawing/2016/5/10/chartex" xmlns:cx5="http://schemas.microsoft.com/office/drawing/2016/5/11/chartex" xmlns:cx6="http://schemas.microsoft.com/office/drawing/2016/5/12/chartex" xmlns:cx7="http://schemas.microsoft.com/office/drawing/2016/5/13/chartex" xmlns:cx8="http://schemas.microsoft.com/office/drawing/2016/5/14/chartex" xmlns:mc="http://schemas.openxmlformats.org/markup-compatibility/2006" xmlns:aink="http://schemas.microsoft.com/office/drawing/2016/ink" xmlns:am3d="http://schemas.microsoft.com/office/drawing/2017/model3d" xmlns:o="urn:schemas-microsoft-com:office:office" xmlns:oel="http://schemas.microsoft.com/office/2019/extlst" xmlns:r="http://schemas.openxmlformats.org/officeDocument/2006/relationships" xmlns:m="http://schemas.openxmlformats.org/officeDocument/2006/math" xmlns:v="urn:schemas-microsoft-com:vml" xmlns:wp14="http://schemas.microsoft.com/office/word/2010/wordprocessingDrawing" xmlns:wp="http://schemas.openxmlformats.org/drawingml/2006/wordprocessingDrawing" xmlns:w10="urn:schemas-microsoft-com:office:word" xmlns:w="http://schemas.openxmlformats.org/wordprocessingml/2006/main" xmlns:w14="http://schemas.microsoft.com/office/word/2010/wordml" xmlns:w15="http://schemas.microsoft.com/office/word/2012/wordml" xmlns:w16cex="http://schemas.microsoft.com/office/word/2018/wordml/cex" xmlns:w16cid="http://schemas.microsoft.com/office/word/2016/wordml/cid" xmlns:w16="http://schemas.microsoft.com/office/word/2018/wordml" xmlns:w16du="http://schemas.microsoft.com/office/word/2023/wordml/word16du" xmlns:w16sdtdh="http://schemas.microsoft.com/office/word/2020/wordml/sdtdatahash" xmlns:w16sdtfl="http://schemas.microsoft.com/office/word/2024/wordml/sdtformatlock" xmlns:w16se="http://schemas.microsoft.com/office/word/2015/wordml/symex" xmlns:wpg="http://schemas.microsoft.com/office/word/2010/wordprocessingGroup" xmlns:wpi="http://schemas.microsoft.com/office/word/2010/wordprocessingInk" xmlns:wne="http://schemas.microsoft.com/office/word/2006/wordml" xmlns:wps="http://schemas.microsoft.com/office/word/2010/wordprocessingShape" mc:Ignorable="w14 w15 w16se w16cid w16 w16cex w16sdtdh w16sdtfl w16du wp14">
   <w:p>
     <w:pPr>
       <w:pStyle w:val="Header"/>
@@ -21552,7 +24922,7 @@
 </file>
 
 <file path=word/styles.xml><?xml version="1.0" encoding="utf-8"?>
-<w:styles xmlns:mc="http://schemas.openxmlformats.org/markup-compatibility/2006" xmlns:r="http://schemas.openxmlformats.org/officeDocument/2006/relationships" xmlns:w="http://schemas.openxmlformats.org/wordprocessingml/2006/main" xmlns:w14="http://schemas.microsoft.com/office/word/2010/wordml" xmlns:w15="http://schemas.microsoft.com/office/word/2012/wordml" xmlns:w16cex="http://schemas.microsoft.com/office/word/2018/wordml/cex" xmlns:w16cid="http://schemas.microsoft.com/office/word/2016/wordml/cid" xmlns:w16="http://schemas.microsoft.com/office/word/2018/wordml" xmlns:w16sdtdh="http://schemas.microsoft.com/office/word/2020/wordml/sdtdatahash" xmlns:w16se="http://schemas.microsoft.com/office/word/2015/wordml/symex" mc:Ignorable="w14 w15 w16se w16cid w16 w16cex w16sdtdh">
+<w:styles xmlns:mc="http://schemas.openxmlformats.org/markup-compatibility/2006" xmlns:r="http://schemas.openxmlformats.org/officeDocument/2006/relationships" xmlns:w="http://schemas.openxmlformats.org/wordprocessingml/2006/main" xmlns:w14="http://schemas.microsoft.com/office/word/2010/wordml" xmlns:w15="http://schemas.microsoft.com/office/word/2012/wordml" xmlns:w16cex="http://schemas.microsoft.com/office/word/2018/wordml/cex" xmlns:w16cid="http://schemas.microsoft.com/office/word/2016/wordml/cid" xmlns:w16="http://schemas.microsoft.com/office/word/2018/wordml" xmlns:w16du="http://schemas.microsoft.com/office/word/2023/wordml/word16du" xmlns:w16sdtdh="http://schemas.microsoft.com/office/word/2020/wordml/sdtdatahash" xmlns:w16sdtfl="http://schemas.microsoft.com/office/word/2024/wordml/sdtformatlock" xmlns:w16se="http://schemas.microsoft.com/office/word/2015/wordml/symex" mc:Ignorable="w14 w15 w16se w16cid w16 w16cex w16sdtdh w16sdtfl w16du">
   <w:docDefaults>
     <w:rPrDefault>
       <w:rPr>
@@ -21943,7 +25313,7 @@
   <w:style w:type="paragraph" w:default="1" w:styleId="Normal">
     <w:name w:val="Normal"/>
     <w:qFormat/>
-    <w:rsid w:val="00076C05"/>
+    <w:rsid w:val="004406CC"/>
     <w:pPr>
       <w:spacing w:before="120" w:line="276" w:lineRule="auto"/>
     </w:pPr>

</xml_diff>